<commit_message>
Fixed docx file bold text
</commit_message>
<xml_diff>
--- a/public/planningTemplate.docx
+++ b/public/planningTemplate.docx
@@ -5,14 +5,14 @@
     <w:p>
       <w:pPr>
         <w:rPr>
-          <w:rFonts w:ascii="Fb CoherentiSansEnHeb" w:hAnsi="Fb CoherentiSansEnHeb" w:cs="Fb CoherentiSansEnHeb"/>
+          <w:rFonts w:ascii="Fb CoherentiSansEnHeb" w:hAnsi="Fb CoherentiSansEnHeb" w:cstheme="minorBidi"/>
           <w:sz w:val="28"/>
           <w:szCs w:val="28"/>
         </w:rPr>
       </w:pPr>
       <w:r>
         <w:rPr>
-          <w:rFonts w:ascii="Fb CoherentiSansEnHeb" w:hAnsi="Fb CoherentiSansEnHeb" w:cs="Fb CoherentiSansEnHeb" w:hint="cs"/>
+          <w:rFonts w:ascii="Fb CoherentiSansEnHeb" w:hAnsi="Fb CoherentiSansEnHeb" w:cstheme="minorBidi" w:hint="cs"/>
           <w:sz w:val="28"/>
           <w:szCs w:val="28"/>
           <w:u w:val="single"/>
@@ -22,7 +22,7 @@
       </w:r>
       <w:r>
         <w:rPr>
-          <w:rFonts w:ascii="Fb CoherentiSansEnHeb" w:hAnsi="Fb CoherentiSansEnHeb" w:cs="Fb CoherentiSansEnHeb" w:hint="cs"/>
+          <w:rFonts w:ascii="Fb CoherentiSansEnHeb" w:hAnsi="Fb CoherentiSansEnHeb" w:cstheme="minorBidi" w:hint="cs"/>
           <w:sz w:val="28"/>
           <w:szCs w:val="28"/>
           <w:rtl/>
@@ -32,7 +32,7 @@
       <w:proofErr w:type="spellStart"/>
       <w:r>
         <w:rPr>
-          <w:rFonts w:ascii="Fb CoherentiSansEnHeb" w:hAnsi="Fb CoherentiSansEnHeb" w:cs="Fb CoherentiSansEnHeb"/>
+          <w:rFonts w:ascii="Fb CoherentiSansEnHeb" w:hAnsi="Fb CoherentiSansEnHeb" w:cstheme="minorBidi"/>
           <w:sz w:val="28"/>
           <w:szCs w:val="28"/>
         </w:rPr>
@@ -41,7 +41,7 @@
       <w:proofErr w:type="spellEnd"/>
       <w:r>
         <w:rPr>
-          <w:rFonts w:ascii="Fb CoherentiSansEnHeb" w:hAnsi="Fb CoherentiSansEnHeb" w:cs="Fb CoherentiSansEnHeb" w:hint="cs"/>
+          <w:rFonts w:ascii="Fb CoherentiSansEnHeb" w:hAnsi="Fb CoherentiSansEnHeb" w:cstheme="minorBidi" w:hint="cs"/>
           <w:sz w:val="28"/>
           <w:szCs w:val="28"/>
           <w:rtl/>
@@ -52,7 +52,7 @@
     <w:p>
       <w:pPr>
         <w:rPr>
-          <w:rFonts w:ascii="Fb CoherentiSansEnHeb" w:hAnsi="Fb CoherentiSansEnHeb" w:cs="Fb CoherentiSansEnHeb"/>
+          <w:rFonts w:ascii="Fb CoherentiSansEnHeb" w:hAnsi="Fb CoherentiSansEnHeb" w:cstheme="minorBidi"/>
           <w:sz w:val="28"/>
           <w:szCs w:val="28"/>
         </w:rPr>
@@ -61,7 +61,7 @@
     <w:p>
       <w:pPr>
         <w:rPr>
-          <w:rFonts w:ascii="Fb CoherentiSansEnHeb" w:hAnsi="Fb CoherentiSansEnHeb" w:cs="Fb CoherentiSansEnHeb"/>
+          <w:rFonts w:ascii="Fb CoherentiSansEnHeb" w:hAnsi="Fb CoherentiSansEnHeb" w:cstheme="minorBidi"/>
           <w:sz w:val="28"/>
           <w:szCs w:val="28"/>
           <w:rtl/>
@@ -73,7 +73,7 @@
         <w:ind w:left="594"/>
         <w:jc w:val="center"/>
         <w:rPr>
-          <w:rFonts w:ascii="Fb CoherentiSansEnHeb Bold" w:hAnsi="Fb CoherentiSansEnHeb Bold" w:cs="Fb CoherentiSansEnHeb Bold"/>
+          <w:rFonts w:ascii="Fb CoherentiSansEnHeb Bold" w:hAnsi="Fb CoherentiSansEnHeb Bold" w:cstheme="majorBidi"/>
           <w:b/>
           <w:bCs/>
           <w:sz w:val="40"/>
@@ -84,7 +84,7 @@
       </w:pPr>
       <w:r>
         <w:rPr>
-          <w:rFonts w:ascii="Fb CoherentiSansEnHeb Bold" w:hAnsi="Fb CoherentiSansEnHeb Bold" w:cs="Fb CoherentiSansEnHeb Bold" w:hint="cs"/>
+          <w:rFonts w:ascii="Fb CoherentiSansEnHeb Bold" w:hAnsi="Fb CoherentiSansEnHeb Bold" w:cstheme="majorBidi" w:hint="cs"/>
           <w:b/>
           <w:bCs/>
           <w:sz w:val="40"/>
@@ -96,7 +96,7 @@
       </w:r>
       <w:r>
         <w:rPr>
-          <w:rFonts w:ascii="Fb CoherentiSansEnHeb Bold" w:hAnsi="Fb CoherentiSansEnHeb Bold" w:cs="Fb CoherentiSansEnHeb Bold"/>
+          <w:rFonts w:ascii="Fb CoherentiSansEnHeb Bold" w:hAnsi="Fb CoherentiSansEnHeb Bold" w:cstheme="majorBidi"/>
           <w:b/>
           <w:bCs/>
           <w:sz w:val="40"/>
@@ -107,7 +107,7 @@
       </w:r>
       <w:r>
         <w:rPr>
-          <w:rFonts w:ascii="Fb CoherentiSansEnHeb Bold" w:hAnsi="Fb CoherentiSansEnHeb Bold" w:cs="Fb CoherentiSansEnHeb Bold" w:hint="cs"/>
+          <w:rFonts w:ascii="Fb CoherentiSansEnHeb Bold" w:hAnsi="Fb CoherentiSansEnHeb Bold" w:cstheme="majorBidi" w:hint="cs"/>
           <w:b/>
           <w:bCs/>
           <w:sz w:val="40"/>
@@ -119,7 +119,7 @@
       </w:r>
       <w:r>
         <w:rPr>
-          <w:rFonts w:ascii="Fb CoherentiSansEnHeb Bold" w:hAnsi="Fb CoherentiSansEnHeb Bold" w:cs="Fb CoherentiSansEnHeb Bold"/>
+          <w:rFonts w:ascii="Fb CoherentiSansEnHeb Bold" w:hAnsi="Fb CoherentiSansEnHeb Bold" w:cstheme="majorBidi"/>
           <w:b/>
           <w:bCs/>
           <w:sz w:val="40"/>
@@ -131,7 +131,7 @@
       </w:r>
       <w:r>
         <w:rPr>
-          <w:rFonts w:ascii="Fb CoherentiSansEnHeb Bold" w:hAnsi="Fb CoherentiSansEnHeb Bold" w:cs="Fb CoherentiSansEnHeb Bold" w:hint="cs"/>
+          <w:rFonts w:ascii="Fb CoherentiSansEnHeb Bold" w:hAnsi="Fb CoherentiSansEnHeb Bold" w:cstheme="majorBidi" w:hint="cs"/>
           <w:b/>
           <w:bCs/>
           <w:sz w:val="40"/>
@@ -143,7 +143,7 @@
       </w:r>
       <w:r>
         <w:rPr>
-          <w:rFonts w:ascii="Fb CoherentiSansEnHeb Bold" w:hAnsi="Fb CoherentiSansEnHeb Bold" w:cs="Fb CoherentiSansEnHeb Bold"/>
+          <w:rFonts w:ascii="Fb CoherentiSansEnHeb Bold" w:hAnsi="Fb CoherentiSansEnHeb Bold" w:cstheme="majorBidi"/>
           <w:b/>
           <w:bCs/>
           <w:sz w:val="40"/>
@@ -156,7 +156,7 @@
       <w:proofErr w:type="spellStart"/>
       <w:r>
         <w:rPr>
-          <w:rFonts w:ascii="Fb CoherentiSansEnHeb Bold" w:hAnsi="Fb CoherentiSansEnHeb Bold" w:cs="Fb CoherentiSansEnHeb Bold"/>
+          <w:rFonts w:ascii="Fb CoherentiSansEnHeb Bold" w:hAnsi="Fb CoherentiSansEnHeb Bold" w:cstheme="majorBidi"/>
           <w:b/>
           <w:bCs/>
           <w:sz w:val="40"/>
@@ -168,7 +168,7 @@
       <w:proofErr w:type="spellEnd"/>
       <w:r>
         <w:rPr>
-          <w:rFonts w:ascii="Fb CoherentiSansEnHeb Bold" w:hAnsi="Fb CoherentiSansEnHeb Bold" w:cs="Fb CoherentiSansEnHeb Bold"/>
+          <w:rFonts w:ascii="Fb CoherentiSansEnHeb Bold" w:hAnsi="Fb CoherentiSansEnHeb Bold" w:cstheme="majorBidi"/>
           <w:b/>
           <w:bCs/>
           <w:sz w:val="40"/>
@@ -179,12 +179,18 @@
         <w:t>}</w:t>
       </w:r>
     </w:p>
-    <w:p/>
     <w:p>
       <w:pPr>
+        <w:rPr>
+          <w:rFonts w:cstheme="minorBidi"/>
+        </w:rPr>
+      </w:pPr>
+    </w:p>
+    <w:p>
+      <w:pPr>
         <w:ind w:left="594"/>
         <w:rPr>
-          <w:rFonts w:ascii="Fb CoherentiSansEnHeb" w:hAnsi="Fb CoherentiSansEnHeb" w:cs="Fb CoherentiSansEnHeb"/>
+          <w:rFonts w:ascii="Fb CoherentiSansEnHeb" w:hAnsi="Fb CoherentiSansEnHeb" w:cstheme="minorBidi"/>
           <w:sz w:val="30"/>
           <w:szCs w:val="30"/>
           <w:rtl/>
@@ -192,7 +198,7 @@
       </w:pPr>
       <w:r>
         <w:rPr>
-          <w:rFonts w:ascii="Fb CoherentiSansEnHeb" w:hAnsi="Fb CoherentiSansEnHeb" w:cs="Fb CoherentiSansEnHeb" w:hint="cs"/>
+          <w:rFonts w:ascii="Fb CoherentiSansEnHeb" w:hAnsi="Fb CoherentiSansEnHeb" w:cstheme="minorBidi" w:hint="cs"/>
           <w:sz w:val="30"/>
           <w:szCs w:val="30"/>
           <w:rtl/>
@@ -201,7 +207,7 @@
       </w:r>
       <w:r>
         <w:rPr>
-          <w:rFonts w:ascii="Fb CoherentiSansEnHeb" w:hAnsi="Fb CoherentiSansEnHeb" w:cs="Fb CoherentiSansEnHeb"/>
+          <w:rFonts w:ascii="Fb CoherentiSansEnHeb" w:hAnsi="Fb CoherentiSansEnHeb" w:cstheme="minorBidi"/>
           <w:sz w:val="30"/>
           <w:szCs w:val="30"/>
           <w:rtl/>
@@ -210,7 +216,7 @@
       </w:r>
       <w:r>
         <w:rPr>
-          <w:rFonts w:ascii="Fb CoherentiSansEnHeb" w:hAnsi="Fb CoherentiSansEnHeb" w:cs="Fb CoherentiSansEnHeb" w:hint="cs"/>
+          <w:rFonts w:ascii="Fb CoherentiSansEnHeb" w:hAnsi="Fb CoherentiSansEnHeb" w:cstheme="minorBidi" w:hint="cs"/>
           <w:sz w:val="30"/>
           <w:szCs w:val="30"/>
           <w:rtl/>
@@ -220,7 +226,7 @@
       <w:proofErr w:type="spellStart"/>
       <w:r>
         <w:rPr>
-          <w:rFonts w:ascii="Fb CoherentiSansEnHeb" w:hAnsi="Fb CoherentiSansEnHeb" w:cs="Fb CoherentiSansEnHeb" w:hint="cs"/>
+          <w:rFonts w:ascii="Fb CoherentiSansEnHeb" w:hAnsi="Fb CoherentiSansEnHeb" w:cstheme="minorBidi" w:hint="cs"/>
           <w:sz w:val="30"/>
           <w:szCs w:val="30"/>
           <w:rtl/>
@@ -230,7 +236,7 @@
       <w:proofErr w:type="spellEnd"/>
       <w:r>
         <w:rPr>
-          <w:rFonts w:ascii="Fb CoherentiSansEnHeb" w:hAnsi="Fb CoherentiSansEnHeb" w:cs="Fb CoherentiSansEnHeb" w:hint="cs"/>
+          <w:rFonts w:ascii="Fb CoherentiSansEnHeb" w:hAnsi="Fb CoherentiSansEnHeb" w:cstheme="minorBidi" w:hint="cs"/>
           <w:sz w:val="30"/>
           <w:szCs w:val="30"/>
           <w:rtl/>
@@ -239,7 +245,7 @@
       </w:r>
       <w:r>
         <w:rPr>
-          <w:rFonts w:ascii="Fb CoherentiSansEnHeb" w:hAnsi="Fb CoherentiSansEnHeb" w:cs="Fb CoherentiSansEnHeb"/>
+          <w:rFonts w:ascii="Fb CoherentiSansEnHeb" w:hAnsi="Fb CoherentiSansEnHeb" w:cstheme="minorBidi"/>
           <w:sz w:val="30"/>
           <w:szCs w:val="30"/>
         </w:rPr>
@@ -247,7 +253,7 @@
       </w:r>
       <w:r>
         <w:rPr>
-          <w:rFonts w:ascii="Fb CoherentiSansEnHeb" w:hAnsi="Fb CoherentiSansEnHeb" w:cs="Fb CoherentiSansEnHeb" w:hint="cs"/>
+          <w:rFonts w:ascii="Fb CoherentiSansEnHeb" w:hAnsi="Fb CoherentiSansEnHeb" w:cstheme="minorBidi" w:hint="cs"/>
           <w:sz w:val="30"/>
           <w:szCs w:val="30"/>
           <w:rtl/>
@@ -257,7 +263,7 @@
       <w:proofErr w:type="spellStart"/>
       <w:r>
         <w:rPr>
-          <w:rFonts w:ascii="Fb CoherentiSansEnHeb" w:hAnsi="Fb CoherentiSansEnHeb" w:cs="Fb CoherentiSansEnHeb" w:hint="cs"/>
+          <w:rFonts w:ascii="Fb CoherentiSansEnHeb" w:hAnsi="Fb CoherentiSansEnHeb" w:cstheme="minorBidi" w:hint="cs"/>
           <w:sz w:val="30"/>
           <w:szCs w:val="30"/>
           <w:rtl/>
@@ -267,7 +273,7 @@
       <w:proofErr w:type="spellEnd"/>
       <w:r>
         <w:rPr>
-          <w:rFonts w:ascii="Fb CoherentiSansEnHeb" w:hAnsi="Fb CoherentiSansEnHeb" w:cs="Fb CoherentiSansEnHeb" w:hint="cs"/>
+          <w:rFonts w:ascii="Fb CoherentiSansEnHeb" w:hAnsi="Fb CoherentiSansEnHeb" w:cstheme="minorBidi" w:hint="cs"/>
           <w:sz w:val="30"/>
           <w:szCs w:val="30"/>
           <w:rtl/>
@@ -279,7 +285,7 @@
       <w:pPr>
         <w:ind w:left="594"/>
         <w:rPr>
-          <w:rFonts w:ascii="Fb CoherentiSansEnHeb" w:hAnsi="Fb CoherentiSansEnHeb" w:cs="Fb CoherentiSansEnHeb"/>
+          <w:rFonts w:ascii="Fb CoherentiSansEnHeb" w:hAnsi="Fb CoherentiSansEnHeb" w:cstheme="minorBidi"/>
           <w:sz w:val="30"/>
           <w:szCs w:val="30"/>
           <w:rtl/>
@@ -287,7 +293,7 @@
       </w:pPr>
       <w:r>
         <w:rPr>
-          <w:rFonts w:ascii="Fb CoherentiSansEnHeb" w:hAnsi="Fb CoherentiSansEnHeb" w:cs="Fb CoherentiSansEnHeb" w:hint="cs"/>
+          <w:rFonts w:ascii="Fb CoherentiSansEnHeb" w:hAnsi="Fb CoherentiSansEnHeb" w:cstheme="minorBidi" w:hint="cs"/>
           <w:sz w:val="30"/>
           <w:szCs w:val="30"/>
           <w:rtl/>
@@ -296,7 +302,7 @@
       </w:r>
       <w:r>
         <w:rPr>
-          <w:rFonts w:ascii="Fb CoherentiSansEnHeb" w:hAnsi="Fb CoherentiSansEnHeb" w:cs="Fb CoherentiSansEnHeb"/>
+          <w:rFonts w:ascii="Fb CoherentiSansEnHeb" w:hAnsi="Fb CoherentiSansEnHeb" w:cstheme="minorBidi"/>
           <w:sz w:val="30"/>
           <w:szCs w:val="30"/>
         </w:rPr>
@@ -304,7 +310,7 @@
       </w:r>
       <w:r>
         <w:rPr>
-          <w:rFonts w:ascii="Fb CoherentiSansEnHeb" w:hAnsi="Fb CoherentiSansEnHeb" w:cs="Fb CoherentiSansEnHeb" w:hint="cs"/>
+          <w:rFonts w:ascii="Fb CoherentiSansEnHeb" w:hAnsi="Fb CoherentiSansEnHeb" w:cstheme="minorBidi" w:hint="cs"/>
           <w:sz w:val="30"/>
           <w:szCs w:val="30"/>
           <w:rtl/>
@@ -320,7 +326,7 @@
           <w:numId w:val="24"/>
         </w:numPr>
         <w:rPr>
-          <w:rFonts w:ascii="Fb CoherentiSansEnHeb Medium" w:hAnsi="Fb CoherentiSansEnHeb Medium" w:cs="Fb CoherentiSansEnHeb Medium"/>
+          <w:rFonts w:ascii="Fb CoherentiSansEnHeb Medium" w:hAnsi="Fb CoherentiSansEnHeb Medium" w:cstheme="minorBidi"/>
           <w:sz w:val="30"/>
           <w:szCs w:val="30"/>
           <w:u w:val="single"/>
@@ -328,7 +334,9 @@
       </w:pPr>
       <w:r>
         <w:rPr>
-          <w:rFonts w:ascii="Fb CoherentiSansEnHeb Medium" w:hAnsi="Fb CoherentiSansEnHeb Medium" w:cs="Fb CoherentiSansEnHeb Medium"/>
+          <w:rFonts w:ascii="Fb CoherentiSansEnHeb Medium" w:hAnsi="Fb CoherentiSansEnHeb Medium" w:cstheme="majorBidi"/>
+          <w:b/>
+          <w:bCs/>
           <w:sz w:val="30"/>
           <w:szCs w:val="30"/>
           <w:rtl/>
@@ -337,7 +345,7 @@
       </w:r>
       <w:r>
         <w:rPr>
-          <w:rFonts w:ascii="Fb CoherentiSansEnHeb Medium" w:hAnsi="Fb CoherentiSansEnHeb Medium" w:cs="Fb CoherentiSansEnHeb Medium" w:hint="cs"/>
+          <w:rFonts w:ascii="Fb CoherentiSansEnHeb Medium" w:hAnsi="Fb CoherentiSansEnHeb Medium" w:cstheme="minorBidi" w:hint="cs"/>
           <w:sz w:val="30"/>
           <w:szCs w:val="30"/>
           <w:rtl/>
@@ -346,7 +354,7 @@
       </w:r>
       <w:r>
         <w:rPr>
-          <w:rFonts w:ascii="Fb CoherentiSansEnHeb" w:hAnsi="Fb CoherentiSansEnHeb" w:cs="Fb CoherentiSansEnHeb"/>
+          <w:rFonts w:ascii="Fb CoherentiSansEnHeb" w:hAnsi="Fb CoherentiSansEnHeb" w:cstheme="minorBidi"/>
           <w:sz w:val="30"/>
           <w:szCs w:val="30"/>
           <w:rtl/>
@@ -355,7 +363,7 @@
       </w:r>
       <w:r>
         <w:rPr>
-          <w:rFonts w:ascii="Fb CoherentiSansEnHeb" w:hAnsi="Fb CoherentiSansEnHeb" w:cs="Fb CoherentiSansEnHeb"/>
+          <w:rFonts w:ascii="Fb CoherentiSansEnHeb" w:hAnsi="Fb CoherentiSansEnHeb" w:cstheme="minorBidi"/>
           <w:sz w:val="30"/>
           <w:szCs w:val="30"/>
         </w:rPr>
@@ -370,7 +378,7 @@
           <w:numId w:val="24"/>
         </w:numPr>
         <w:rPr>
-          <w:rFonts w:ascii="Fb CoherentiSansEnHeb Medium" w:hAnsi="Fb CoherentiSansEnHeb Medium" w:cs="Fb CoherentiSansEnHeb Medium"/>
+          <w:rFonts w:ascii="Fb CoherentiSansEnHeb Medium" w:hAnsi="Fb CoherentiSansEnHeb Medium" w:cstheme="minorBidi"/>
           <w:sz w:val="30"/>
           <w:szCs w:val="30"/>
           <w:u w:val="single"/>
@@ -378,7 +386,9 @@
       </w:pPr>
       <w:r>
         <w:rPr>
-          <w:rFonts w:ascii="Fb CoherentiSansEnHeb Medium" w:hAnsi="Fb CoherentiSansEnHeb Medium" w:cs="Fb CoherentiSansEnHeb Medium" w:hint="cs"/>
+          <w:rFonts w:ascii="Fb CoherentiSansEnHeb Medium" w:hAnsi="Fb CoherentiSansEnHeb Medium" w:cstheme="majorBidi" w:hint="cs"/>
+          <w:b/>
+          <w:bCs/>
           <w:sz w:val="30"/>
           <w:szCs w:val="30"/>
           <w:rtl/>
@@ -387,7 +397,9 @@
       </w:r>
       <w:r>
         <w:rPr>
-          <w:rFonts w:ascii="Fb CoherentiSansEnHeb Medium" w:hAnsi="Fb CoherentiSansEnHeb Medium" w:cs="Fb CoherentiSansEnHeb Medium"/>
+          <w:rFonts w:ascii="Fb CoherentiSansEnHeb Medium" w:hAnsi="Fb CoherentiSansEnHeb Medium" w:cstheme="majorBidi"/>
+          <w:b/>
+          <w:bCs/>
           <w:sz w:val="30"/>
           <w:szCs w:val="30"/>
           <w:rtl/>
@@ -396,7 +408,7 @@
       </w:r>
       <w:r>
         <w:rPr>
-          <w:rFonts w:ascii="Fb CoherentiSansEnHeb Medium" w:hAnsi="Fb CoherentiSansEnHeb Medium" w:cs="Fb CoherentiSansEnHeb Medium" w:hint="cs"/>
+          <w:rFonts w:ascii="Fb CoherentiSansEnHeb Medium" w:hAnsi="Fb CoherentiSansEnHeb Medium" w:cstheme="minorBidi" w:hint="cs"/>
           <w:sz w:val="30"/>
           <w:szCs w:val="30"/>
           <w:rtl/>
@@ -405,7 +417,7 @@
       </w:r>
       <w:r>
         <w:rPr>
-          <w:rFonts w:ascii="Fb CoherentiSansEnHeb" w:hAnsi="Fb CoherentiSansEnHeb" w:cs="Fb CoherentiSansEnHeb"/>
+          <w:rFonts w:ascii="Fb CoherentiSansEnHeb" w:hAnsi="Fb CoherentiSansEnHeb" w:cstheme="minorBidi"/>
           <w:sz w:val="30"/>
           <w:szCs w:val="30"/>
           <w:rtl/>
@@ -417,7 +429,7 @@
       <w:pPr>
         <w:ind w:left="594"/>
         <w:rPr>
-          <w:rFonts w:ascii="Fb CoherentiSansEnHeb Medium" w:hAnsi="Fb CoherentiSansEnHeb Medium" w:cs="Fb CoherentiSansEnHeb Medium"/>
+          <w:rFonts w:ascii="Fb CoherentiSansEnHeb Medium" w:hAnsi="Fb CoherentiSansEnHeb Medium" w:cstheme="minorBidi"/>
           <w:sz w:val="30"/>
           <w:szCs w:val="30"/>
           <w:u w:val="single"/>
@@ -428,7 +440,9 @@
       <w:pPr>
         <w:ind w:left="594"/>
         <w:rPr>
-          <w:rFonts w:ascii="Fb CoherentiSansEnHeb Medium" w:hAnsi="Fb CoherentiSansEnHeb Medium" w:cs="Fb CoherentiSansEnHeb Medium"/>
+          <w:rFonts w:ascii="Fb CoherentiSansEnHeb Medium" w:hAnsi="Fb CoherentiSansEnHeb Medium" w:cstheme="majorBidi"/>
+          <w:b/>
+          <w:bCs/>
           <w:sz w:val="32"/>
           <w:szCs w:val="32"/>
           <w:u w:val="single"/>
@@ -437,7 +451,9 @@
       </w:pPr>
       <w:r>
         <w:rPr>
-          <w:rFonts w:ascii="Fb CoherentiSansEnHeb Medium" w:hAnsi="Fb CoherentiSansEnHeb Medium" w:cs="Fb CoherentiSansEnHeb Medium" w:hint="cs"/>
+          <w:rFonts w:ascii="Fb CoherentiSansEnHeb Medium" w:hAnsi="Fb CoherentiSansEnHeb Medium" w:cstheme="majorBidi" w:hint="cs"/>
+          <w:b/>
+          <w:bCs/>
           <w:sz w:val="32"/>
           <w:szCs w:val="32"/>
           <w:u w:val="single"/>
@@ -447,7 +463,9 @@
       </w:r>
       <w:r>
         <w:rPr>
-          <w:rFonts w:ascii="Fb CoherentiSansEnHeb Medium" w:hAnsi="Fb CoherentiSansEnHeb Medium" w:cs="Times New Roman"/>
+          <w:rFonts w:ascii="Fb CoherentiSansEnHeb Medium" w:hAnsi="Fb CoherentiSansEnHeb Medium" w:cstheme="majorBidi"/>
+          <w:b/>
+          <w:bCs/>
           <w:sz w:val="32"/>
           <w:szCs w:val="32"/>
           <w:u w:val="single"/>
@@ -457,7 +475,9 @@
       </w:r>
       <w:r>
         <w:rPr>
-          <w:rFonts w:ascii="Fb CoherentiSansEnHeb Medium" w:hAnsi="Fb CoherentiSansEnHeb Medium" w:cs="Fb CoherentiSansEnHeb Medium" w:hint="cs"/>
+          <w:rFonts w:ascii="Fb CoherentiSansEnHeb Medium" w:hAnsi="Fb CoherentiSansEnHeb Medium" w:cstheme="majorBidi" w:hint="cs"/>
+          <w:b/>
+          <w:bCs/>
           <w:sz w:val="32"/>
           <w:szCs w:val="32"/>
           <w:u w:val="single"/>
@@ -470,7 +490,7 @@
       <w:pPr>
         <w:ind w:left="594"/>
         <w:rPr>
-          <w:rFonts w:ascii="Fb CoherentiSansEnHeb Medium" w:hAnsi="Fb CoherentiSansEnHeb Medium" w:cs="Fb CoherentiSansEnHeb Medium"/>
+          <w:rFonts w:ascii="Fb CoherentiSansEnHeb Medium" w:hAnsi="Fb CoherentiSansEnHeb Medium" w:cstheme="minorBidi"/>
           <w:sz w:val="30"/>
           <w:szCs w:val="30"/>
           <w:rtl/>
@@ -478,7 +498,7 @@
       </w:pPr>
       <w:r>
         <w:rPr>
-          <w:rFonts w:ascii="Fb CoherentiSansEnHeb Medium" w:hAnsi="Fb CoherentiSansEnHeb Medium" w:cs="Fb CoherentiSansEnHeb Medium" w:hint="cs"/>
+          <w:rFonts w:ascii="Fb CoherentiSansEnHeb Medium" w:hAnsi="Fb CoherentiSansEnHeb Medium" w:cstheme="minorBidi" w:hint="cs"/>
           <w:sz w:val="30"/>
           <w:szCs w:val="30"/>
           <w:rtl/>
@@ -487,7 +507,7 @@
       </w:r>
       <w:r>
         <w:rPr>
-          <w:rFonts w:ascii="Fb CoherentiSansEnHeb Medium" w:hAnsi="Fb CoherentiSansEnHeb Medium" w:cs="Fb CoherentiSansEnHeb Medium"/>
+          <w:rFonts w:ascii="Fb CoherentiSansEnHeb Medium" w:hAnsi="Fb CoherentiSansEnHeb Medium" w:cstheme="minorBidi"/>
           <w:sz w:val="30"/>
           <w:szCs w:val="30"/>
         </w:rPr>
@@ -495,7 +515,7 @@
       </w:r>
       <w:r>
         <w:rPr>
-          <w:rFonts w:ascii="Fb CoherentiSansEnHeb Medium" w:hAnsi="Fb CoherentiSansEnHeb Medium" w:cs="Fb CoherentiSansEnHeb Medium" w:hint="cs"/>
+          <w:rFonts w:ascii="Fb CoherentiSansEnHeb Medium" w:hAnsi="Fb CoherentiSansEnHeb Medium" w:cstheme="minorBidi" w:hint="cs"/>
           <w:sz w:val="30"/>
           <w:szCs w:val="30"/>
           <w:rtl/>
@@ -507,7 +527,9 @@
       <w:pPr>
         <w:ind w:left="594"/>
         <w:rPr>
-          <w:rFonts w:ascii="Fb CoherentiSansEnHeb Medium" w:hAnsi="Fb CoherentiSansEnHeb Medium" w:cs="Fb CoherentiSansEnHeb Medium"/>
+          <w:rFonts w:ascii="Fb CoherentiSansEnHeb Medium" w:hAnsi="Fb CoherentiSansEnHeb Medium" w:cstheme="majorBidi"/>
+          <w:b/>
+          <w:bCs/>
           <w:sz w:val="30"/>
           <w:szCs w:val="30"/>
           <w:u w:val="single"/>
@@ -516,7 +538,9 @@
       </w:pPr>
       <w:r>
         <w:rPr>
-          <w:rFonts w:ascii="Fb CoherentiSansEnHeb Medium" w:hAnsi="Fb CoherentiSansEnHeb Medium" w:cs="Fb CoherentiSansEnHeb Medium" w:hint="cs"/>
+          <w:rFonts w:ascii="Fb CoherentiSansEnHeb Medium" w:hAnsi="Fb CoherentiSansEnHeb Medium" w:cstheme="majorBidi" w:hint="cs"/>
+          <w:b/>
+          <w:bCs/>
           <w:sz w:val="30"/>
           <w:szCs w:val="30"/>
           <w:u w:val="single"/>
@@ -526,7 +550,9 @@
       </w:r>
       <w:r>
         <w:rPr>
-          <w:rFonts w:ascii="Fb CoherentiSansEnHeb Medium" w:hAnsi="Fb CoherentiSansEnHeb Medium" w:cs="Times New Roman"/>
+          <w:rFonts w:ascii="Fb CoherentiSansEnHeb Medium" w:hAnsi="Fb CoherentiSansEnHeb Medium" w:cstheme="majorBidi"/>
+          <w:b/>
+          <w:bCs/>
           <w:sz w:val="30"/>
           <w:szCs w:val="30"/>
           <w:u w:val="single"/>
@@ -536,7 +562,9 @@
       </w:r>
       <w:r>
         <w:rPr>
-          <w:rFonts w:ascii="Fb CoherentiSansEnHeb Medium" w:hAnsi="Fb CoherentiSansEnHeb Medium" w:cs="Fb CoherentiSansEnHeb Medium" w:hint="cs"/>
+          <w:rFonts w:ascii="Fb CoherentiSansEnHeb Medium" w:hAnsi="Fb CoherentiSansEnHeb Medium" w:cstheme="majorBidi" w:hint="cs"/>
+          <w:b/>
+          <w:bCs/>
           <w:sz w:val="30"/>
           <w:szCs w:val="30"/>
           <w:u w:val="single"/>
@@ -546,7 +574,9 @@
       </w:r>
       <w:r>
         <w:rPr>
-          <w:rFonts w:ascii="Fb CoherentiSansEnHeb Medium" w:hAnsi="Fb CoherentiSansEnHeb Medium" w:cs="Fb CoherentiSansEnHeb Medium"/>
+          <w:rFonts w:ascii="Fb CoherentiSansEnHeb Medium" w:hAnsi="Fb CoherentiSansEnHeb Medium" w:cstheme="majorBidi"/>
+          <w:b/>
+          <w:bCs/>
           <w:sz w:val="30"/>
           <w:szCs w:val="30"/>
           <w:u w:val="single"/>
@@ -555,7 +585,9 @@
       </w:r>
       <w:r>
         <w:rPr>
-          <w:rFonts w:ascii="Fb CoherentiSansEnHeb Medium" w:hAnsi="Fb CoherentiSansEnHeb Medium" w:cs="Fb CoherentiSansEnHeb Medium" w:hint="cs"/>
+          <w:rFonts w:ascii="Fb CoherentiSansEnHeb Medium" w:hAnsi="Fb CoherentiSansEnHeb Medium" w:cstheme="majorBidi" w:hint="cs"/>
+          <w:b/>
+          <w:bCs/>
           <w:sz w:val="30"/>
           <w:szCs w:val="30"/>
           <w:u w:val="single"/>
@@ -568,7 +600,7 @@
       <w:pPr>
         <w:ind w:left="594"/>
         <w:rPr>
-          <w:rFonts w:ascii="Fb CoherentiSansEnHeb Medium" w:hAnsi="Fb CoherentiSansEnHeb Medium" w:cs="Fb CoherentiSansEnHeb Medium"/>
+          <w:rFonts w:ascii="Fb CoherentiSansEnHeb Medium" w:hAnsi="Fb CoherentiSansEnHeb Medium" w:cstheme="minorBidi"/>
           <w:sz w:val="30"/>
           <w:szCs w:val="30"/>
           <w:rtl/>
@@ -579,7 +611,9 @@
       <w:pPr>
         <w:ind w:left="594"/>
         <w:rPr>
-          <w:rFonts w:ascii="Fb CoherentiSansEnHeb Medium" w:hAnsi="Fb CoherentiSansEnHeb Medium" w:cs="Fb CoherentiSansEnHeb Medium"/>
+          <w:rFonts w:ascii="Fb CoherentiSansEnHeb Medium" w:hAnsi="Fb CoherentiSansEnHeb Medium" w:cstheme="majorBidi"/>
+          <w:b/>
+          <w:bCs/>
           <w:sz w:val="32"/>
           <w:szCs w:val="32"/>
           <w:u w:val="single"/>
@@ -588,80 +622,46 @@
       </w:pPr>
       <w:r>
         <w:rPr>
-          <w:rFonts w:ascii="Fb CoherentiSansEnHeb Medium" w:hAnsi="Fb CoherentiSansEnHeb Medium" w:cs="Fb CoherentiSansEnHeb Medium" w:hint="cs"/>
+          <w:rFonts w:ascii="Fb CoherentiSansEnHeb Medium" w:hAnsi="Fb CoherentiSansEnHeb Medium" w:cstheme="majorBidi" w:hint="cs"/>
+          <w:b/>
+          <w:bCs/>
           <w:sz w:val="32"/>
           <w:szCs w:val="32"/>
           <w:u w:val="single"/>
           <w:rtl/>
         </w:rPr>
-        <w:t xml:space="preserve">שלב </w:t>
-      </w:r>
-      <w:r>
-        <w:rPr>
-          <w:rFonts w:ascii="Fb CoherentiSansEnHeb Medium" w:hAnsi="Fb CoherentiSansEnHeb Medium" w:cs="Fb CoherentiSansEnHeb Medium" w:hint="cs"/>
+        <w:t xml:space="preserve">שלב 2 </w:t>
+      </w:r>
+      <w:r>
+        <w:rPr>
+          <w:rFonts w:ascii="Fb CoherentiSansEnHeb Medium" w:hAnsi="Fb CoherentiSansEnHeb Medium" w:cstheme="majorBidi"/>
+          <w:b/>
+          <w:bCs/>
           <w:sz w:val="32"/>
           <w:szCs w:val="32"/>
           <w:u w:val="single"/>
           <w:rtl/>
         </w:rPr>
-        <w:t>2</w:t>
-      </w:r>
-      <w:r>
-        <w:rPr>
-          <w:rFonts w:ascii="Fb CoherentiSansEnHeb Medium" w:hAnsi="Fb CoherentiSansEnHeb Medium" w:cs="Fb CoherentiSansEnHeb Medium" w:hint="cs"/>
+        <w:t>–</w:t>
+      </w:r>
+      <w:r>
+        <w:rPr>
+          <w:rFonts w:ascii="Fb CoherentiSansEnHeb Medium" w:hAnsi="Fb CoherentiSansEnHeb Medium" w:cstheme="majorBidi" w:hint="cs"/>
+          <w:b/>
+          <w:bCs/>
           <w:sz w:val="32"/>
           <w:szCs w:val="32"/>
           <w:u w:val="single"/>
           <w:rtl/>
         </w:rPr>
-        <w:t xml:space="preserve"> </w:t>
-      </w:r>
-      <w:r>
-        <w:rPr>
-          <w:rFonts w:ascii="Fb CoherentiSansEnHeb Medium" w:hAnsi="Fb CoherentiSansEnHeb Medium" w:cs="Times New Roman"/>
-          <w:sz w:val="32"/>
-          <w:szCs w:val="32"/>
-          <w:u w:val="single"/>
-          <w:rtl/>
-        </w:rPr>
-        <w:t>–</w:t>
-      </w:r>
-      <w:r>
-        <w:rPr>
-          <w:rFonts w:ascii="Fb CoherentiSansEnHeb Medium" w:hAnsi="Fb CoherentiSansEnHeb Medium" w:cs="Fb CoherentiSansEnHeb Medium" w:hint="cs"/>
-          <w:sz w:val="32"/>
-          <w:szCs w:val="32"/>
-          <w:u w:val="single"/>
-          <w:rtl/>
-        </w:rPr>
-        <w:t xml:space="preserve"> </w:t>
-      </w:r>
-      <w:r>
-        <w:rPr>
-          <w:rFonts w:ascii="Fb CoherentiSansEnHeb Medium" w:hAnsi="Fb CoherentiSansEnHeb Medium" w:cs="Fb CoherentiSansEnHeb Medium" w:hint="cs"/>
-          <w:sz w:val="32"/>
-          <w:szCs w:val="32"/>
-          <w:u w:val="single"/>
-          <w:rtl/>
-        </w:rPr>
-        <w:t>יישום בפועל</w:t>
-      </w:r>
-      <w:r>
-        <w:rPr>
-          <w:rFonts w:ascii="Fb CoherentiSansEnHeb Medium" w:hAnsi="Fb CoherentiSansEnHeb Medium" w:cs="Fb CoherentiSansEnHeb Medium" w:hint="cs"/>
-          <w:sz w:val="32"/>
-          <w:szCs w:val="32"/>
-          <w:u w:val="single"/>
-          <w:rtl/>
-        </w:rPr>
-        <w:t>:</w:t>
+        <w:t xml:space="preserve"> יישום בפועל:</w:t>
       </w:r>
     </w:p>
     <w:p>
       <w:pPr>
         <w:ind w:left="594"/>
         <w:rPr>
-          <w:rFonts w:ascii="Fb CoherentiSansEnHeb Medium" w:hAnsi="Fb CoherentiSansEnHeb Medium" w:cs="Fb CoherentiSansEnHeb Medium"/>
+          <w:rFonts w:ascii="Fb CoherentiSansEnHeb Medium" w:hAnsi="Fb CoherentiSansEnHeb Medium" w:cstheme="minorBidi"/>
           <w:sz w:val="30"/>
           <w:szCs w:val="30"/>
           <w:rtl/>
@@ -669,7 +669,7 @@
       </w:pPr>
       <w:r>
         <w:rPr>
-          <w:rFonts w:ascii="Fb CoherentiSansEnHeb Medium" w:hAnsi="Fb CoherentiSansEnHeb Medium" w:cs="Fb CoherentiSansEnHeb Medium" w:hint="cs"/>
+          <w:rFonts w:ascii="Fb CoherentiSansEnHeb Medium" w:hAnsi="Fb CoherentiSansEnHeb Medium" w:cstheme="minorBidi" w:hint="cs"/>
           <w:sz w:val="30"/>
           <w:szCs w:val="30"/>
           <w:rtl/>
@@ -678,7 +678,7 @@
       </w:r>
       <w:r>
         <w:rPr>
-          <w:rFonts w:ascii="Fb CoherentiSansEnHeb Medium" w:hAnsi="Fb CoherentiSansEnHeb Medium" w:cs="Fb CoherentiSansEnHeb Medium"/>
+          <w:rFonts w:ascii="Fb CoherentiSansEnHeb Medium" w:hAnsi="Fb CoherentiSansEnHeb Medium" w:cstheme="minorBidi"/>
           <w:sz w:val="30"/>
           <w:szCs w:val="30"/>
         </w:rPr>
@@ -686,7 +686,7 @@
       </w:r>
       <w:r>
         <w:rPr>
-          <w:rFonts w:ascii="Fb CoherentiSansEnHeb Medium" w:hAnsi="Fb CoherentiSansEnHeb Medium" w:cs="Fb CoherentiSansEnHeb Medium" w:hint="cs"/>
+          <w:rFonts w:ascii="Fb CoherentiSansEnHeb Medium" w:hAnsi="Fb CoherentiSansEnHeb Medium" w:cstheme="minorBidi" w:hint="cs"/>
           <w:sz w:val="30"/>
           <w:szCs w:val="30"/>
           <w:rtl/>
@@ -698,7 +698,9 @@
       <w:pPr>
         <w:ind w:left="594"/>
         <w:rPr>
-          <w:rFonts w:ascii="Fb CoherentiSansEnHeb Medium" w:hAnsi="Fb CoherentiSansEnHeb Medium" w:cs="Fb CoherentiSansEnHeb Medium"/>
+          <w:rFonts w:ascii="Fb CoherentiSansEnHeb Medium" w:hAnsi="Fb CoherentiSansEnHeb Medium" w:cstheme="majorBidi"/>
+          <w:b/>
+          <w:bCs/>
           <w:sz w:val="30"/>
           <w:szCs w:val="30"/>
           <w:u w:val="single"/>
@@ -707,7 +709,9 @@
       </w:pPr>
       <w:r>
         <w:rPr>
-          <w:rFonts w:ascii="Fb CoherentiSansEnHeb Medium" w:hAnsi="Fb CoherentiSansEnHeb Medium" w:cs="Fb CoherentiSansEnHeb Medium" w:hint="cs"/>
+          <w:rFonts w:ascii="Fb CoherentiSansEnHeb Medium" w:hAnsi="Fb CoherentiSansEnHeb Medium" w:cstheme="majorBidi" w:hint="cs"/>
+          <w:b/>
+          <w:bCs/>
           <w:sz w:val="30"/>
           <w:szCs w:val="30"/>
           <w:u w:val="single"/>
@@ -717,7 +721,9 @@
       </w:r>
       <w:r>
         <w:rPr>
-          <w:rFonts w:ascii="Fb CoherentiSansEnHeb Medium" w:hAnsi="Fb CoherentiSansEnHeb Medium" w:cs="Times New Roman"/>
+          <w:rFonts w:ascii="Fb CoherentiSansEnHeb Medium" w:hAnsi="Fb CoherentiSansEnHeb Medium" w:cstheme="majorBidi"/>
+          <w:b/>
+          <w:bCs/>
           <w:sz w:val="30"/>
           <w:szCs w:val="30"/>
           <w:u w:val="single"/>
@@ -727,7 +733,9 @@
       </w:r>
       <w:r>
         <w:rPr>
-          <w:rFonts w:ascii="Fb CoherentiSansEnHeb Medium" w:hAnsi="Fb CoherentiSansEnHeb Medium" w:cs="Fb CoherentiSansEnHeb Medium" w:hint="cs"/>
+          <w:rFonts w:ascii="Fb CoherentiSansEnHeb Medium" w:hAnsi="Fb CoherentiSansEnHeb Medium" w:cstheme="majorBidi" w:hint="cs"/>
+          <w:b/>
+          <w:bCs/>
           <w:sz w:val="30"/>
           <w:szCs w:val="30"/>
           <w:u w:val="single"/>
@@ -737,7 +745,9 @@
       </w:r>
       <w:r>
         <w:rPr>
-          <w:rFonts w:ascii="Fb CoherentiSansEnHeb Medium" w:hAnsi="Fb CoherentiSansEnHeb Medium" w:cs="Fb CoherentiSansEnHeb Medium"/>
+          <w:rFonts w:ascii="Fb CoherentiSansEnHeb Medium" w:hAnsi="Fb CoherentiSansEnHeb Medium" w:cstheme="majorBidi"/>
+          <w:b/>
+          <w:bCs/>
           <w:sz w:val="30"/>
           <w:szCs w:val="30"/>
           <w:u w:val="single"/>
@@ -746,7 +756,9 @@
       </w:r>
       <w:r>
         <w:rPr>
-          <w:rFonts w:ascii="Fb CoherentiSansEnHeb Medium" w:hAnsi="Fb CoherentiSansEnHeb Medium" w:cs="Fb CoherentiSansEnHeb Medium" w:hint="cs"/>
+          <w:rFonts w:ascii="Fb CoherentiSansEnHeb Medium" w:hAnsi="Fb CoherentiSansEnHeb Medium" w:cstheme="majorBidi" w:hint="cs"/>
+          <w:b/>
+          <w:bCs/>
           <w:sz w:val="30"/>
           <w:szCs w:val="30"/>
           <w:u w:val="single"/>
@@ -759,7 +771,7 @@
       <w:pPr>
         <w:ind w:left="594"/>
         <w:rPr>
-          <w:rFonts w:ascii="Fb CoherentiSansEnHeb Medium" w:hAnsi="Fb CoherentiSansEnHeb Medium" w:cs="Fb CoherentiSansEnHeb Medium"/>
+          <w:rFonts w:ascii="Fb CoherentiSansEnHeb Medium" w:hAnsi="Fb CoherentiSansEnHeb Medium" w:cstheme="minorBidi"/>
           <w:sz w:val="30"/>
           <w:szCs w:val="30"/>
           <w:rtl/>
@@ -770,16 +782,21 @@
       <w:pPr>
         <w:ind w:left="594"/>
         <w:rPr>
-          <w:rFonts w:ascii="Fb CoherentiSansEnHeb Medium" w:hAnsi="Fb CoherentiSansEnHeb Medium" w:cs="Fb CoherentiSansEnHeb Medium"/>
+          <w:rFonts w:ascii="Fb CoherentiSansEnHeb Medium" w:hAnsi="Fb CoherentiSansEnHeb Medium" w:cstheme="majorBidi"/>
+          <w:b/>
+          <w:bCs/>
           <w:sz w:val="36"/>
           <w:szCs w:val="30"/>
           <w:u w:val="single"/>
           <w:rtl/>
         </w:rPr>
       </w:pPr>
-      <w:r>
-        <w:rPr>
-          <w:rFonts w:ascii="Fb CoherentiSansEnHeb Medium" w:hAnsi="Fb CoherentiSansEnHeb Medium" w:cs="Fb CoherentiSansEnHeb Medium"/>
+      <w:bookmarkStart w:id="0" w:name="_GoBack"/>
+      <w:r>
+        <w:rPr>
+          <w:rFonts w:ascii="Fb CoherentiSansEnHeb Medium" w:hAnsi="Fb CoherentiSansEnHeb Medium" w:cstheme="majorBidi"/>
+          <w:b/>
+          <w:bCs/>
           <w:sz w:val="36"/>
           <w:szCs w:val="30"/>
           <w:u w:val="single"/>
@@ -789,7 +806,9 @@
       </w:r>
       <w:r>
         <w:rPr>
-          <w:rFonts w:ascii="Fb CoherentiSansEnHeb Medium" w:hAnsi="Fb CoherentiSansEnHeb Medium" w:cs="Fb CoherentiSansEnHeb Medium"/>
+          <w:rFonts w:ascii="Fb CoherentiSansEnHeb Medium" w:hAnsi="Fb CoherentiSansEnHeb Medium" w:cstheme="majorBidi"/>
+          <w:b/>
+          <w:bCs/>
           <w:sz w:val="30"/>
           <w:szCs w:val="30"/>
           <w:u w:val="single"/>
@@ -799,7 +818,9 @@
       <w:proofErr w:type="spellStart"/>
       <w:r>
         <w:rPr>
-          <w:rFonts w:ascii="Fb CoherentiSansEnHeb Medium" w:hAnsi="Fb CoherentiSansEnHeb Medium" w:cs="Fb CoherentiSansEnHeb Medium"/>
+          <w:rFonts w:ascii="Fb CoherentiSansEnHeb Medium" w:hAnsi="Fb CoherentiSansEnHeb Medium" w:cstheme="majorBidi"/>
+          <w:b/>
+          <w:bCs/>
           <w:sz w:val="30"/>
           <w:szCs w:val="30"/>
           <w:u w:val="single"/>
@@ -809,7 +830,9 @@
       <w:proofErr w:type="spellEnd"/>
       <w:r>
         <w:rPr>
-          <w:rFonts w:ascii="Fb CoherentiSansEnHeb Medium" w:hAnsi="Fb CoherentiSansEnHeb Medium" w:cs="Fb CoherentiSansEnHeb Medium"/>
+          <w:rFonts w:ascii="Fb CoherentiSansEnHeb Medium" w:hAnsi="Fb CoherentiSansEnHeb Medium" w:cstheme="majorBidi"/>
+          <w:b/>
+          <w:bCs/>
           <w:sz w:val="30"/>
           <w:szCs w:val="30"/>
           <w:u w:val="single"/>
@@ -818,7 +841,9 @@
       </w:r>
       <w:r>
         <w:rPr>
-          <w:rFonts w:ascii="Fb CoherentiSansEnHeb Medium" w:hAnsi="Fb CoherentiSansEnHeb Medium" w:cs="Fb CoherentiSansEnHeb Medium"/>
+          <w:rFonts w:ascii="Fb CoherentiSansEnHeb Medium" w:hAnsi="Fb CoherentiSansEnHeb Medium" w:cstheme="majorBidi"/>
+          <w:b/>
+          <w:bCs/>
           <w:sz w:val="30"/>
           <w:szCs w:val="30"/>
           <w:u w:val="single"/>
@@ -826,14 +851,13 @@
         </w:rPr>
         <w:t xml:space="preserve"> ₪</w:t>
       </w:r>
-      <w:bookmarkStart w:id="0" w:name="_GoBack"/>
-      <w:bookmarkEnd w:id="0"/>
     </w:p>
+    <w:bookmarkEnd w:id="0"/>
     <w:p>
       <w:pPr>
         <w:ind w:left="594"/>
         <w:rPr>
-          <w:rFonts w:ascii="Fb CoherentiSansEnHeb Medium" w:hAnsi="Fb CoherentiSansEnHeb Medium" w:cstheme="majorBidi"/>
+          <w:rFonts w:ascii="Fb CoherentiSansEnHeb Medium" w:hAnsi="Fb CoherentiSansEnHeb Medium" w:cstheme="minorBidi"/>
           <w:sz w:val="32"/>
           <w:szCs w:val="32"/>
           <w:u w:val="single"/>
@@ -5295,7 +5319,7 @@
 </file>
 
 <file path=customXml/itemProps2.xml><?xml version="1.0" encoding="utf-8"?>
-<ds:datastoreItem xmlns:ds="http://schemas.openxmlformats.org/officeDocument/2006/customXml" ds:itemID="{4DA34C9A-8F86-4241-B27D-026DA3CE08F5}">
+<ds:datastoreItem xmlns:ds="http://schemas.openxmlformats.org/officeDocument/2006/customXml" ds:itemID="{E4E45ADB-1682-4846-A459-6E5C97CBB0BB}">
   <ds:schemaRefs>
     <ds:schemaRef ds:uri="http://schemas.openxmlformats.org/officeDocument/2006/bibliography"/>
   </ds:schemaRefs>

</xml_diff>

<commit_message>
Added new template file and webhook to crm
</commit_message>
<xml_diff>
--- a/public/planningTemplate.docx
+++ b/public/planningTemplate.docx
@@ -103,7 +103,18 @@
           <w:szCs w:val="40"/>
           <w:u w:val="single"/>
         </w:rPr>
-        <w:t>P8</w:t>
+        <w:t>P</w:t>
+      </w:r>
+      <w:r>
+        <w:rPr>
+          <w:rFonts w:ascii="Fb CoherentiSansEnHeb Bold" w:hAnsi="Fb CoherentiSansEnHeb Bold" w:cstheme="majorBidi"/>
+          <w:b/>
+          <w:bCs/>
+          <w:sz w:val="40"/>
+          <w:szCs w:val="40"/>
+          <w:u w:val="single"/>
+        </w:rPr>
+        <w:t>6</w:t>
       </w:r>
       <w:r>
         <w:rPr>
@@ -193,9 +204,45 @@
           <w:rFonts w:ascii="Fb CoherentiSansEnHeb" w:hAnsi="Fb CoherentiSansEnHeb" w:cstheme="minorBidi"/>
           <w:sz w:val="30"/>
           <w:szCs w:val="30"/>
-          <w:rtl/>
-        </w:rPr>
-      </w:pPr>
+        </w:rPr>
+      </w:pPr>
+      <w:r>
+        <w:rPr>
+          <w:rFonts w:ascii="Fb CoherentiSansEnHeb" w:hAnsi="Fb CoherentiSansEnHeb" w:cstheme="minorBidi"/>
+          <w:sz w:val="30"/>
+          <w:szCs w:val="30"/>
+          <w:rtl/>
+        </w:rPr>
+        <w:t xml:space="preserve">אני שמח להציג בפניך את ההצעה להיכנס </w:t>
+      </w:r>
+      <w:proofErr w:type="spellStart"/>
+      <w:r>
+        <w:rPr>
+          <w:rFonts w:ascii="Fb CoherentiSansEnHeb" w:hAnsi="Fb CoherentiSansEnHeb" w:cstheme="minorBidi"/>
+          <w:sz w:val="30"/>
+          <w:szCs w:val="30"/>
+          <w:rtl/>
+        </w:rPr>
+        <w:t>איתנו</w:t>
+      </w:r>
+      <w:proofErr w:type="spellEnd"/>
+      <w:r>
+        <w:rPr>
+          <w:rFonts w:ascii="Fb CoherentiSansEnHeb" w:hAnsi="Fb CoherentiSansEnHeb" w:cstheme="minorBidi"/>
+          <w:sz w:val="30"/>
+          <w:szCs w:val="30"/>
+          <w:rtl/>
+        </w:rPr>
+        <w:t xml:space="preserve"> לתהליך ה</w:t>
+      </w:r>
+      <w:r>
+        <w:rPr>
+          <w:rFonts w:ascii="Fb CoherentiSansEnHeb" w:hAnsi="Fb CoherentiSansEnHeb" w:cstheme="minorBidi"/>
+          <w:sz w:val="30"/>
+          <w:szCs w:val="30"/>
+        </w:rPr>
+        <w:t>P6-</w:t>
+      </w:r>
       <w:r>
         <w:rPr>
           <w:rFonts w:ascii="Fb CoherentiSansEnHeb" w:hAnsi="Fb CoherentiSansEnHeb" w:cstheme="minorBidi" w:hint="cs"/>
@@ -203,7 +250,7 @@
           <w:szCs w:val="30"/>
           <w:rtl/>
         </w:rPr>
-        <w:t>אנו</w:t>
+        <w:t xml:space="preserve"> </w:t>
       </w:r>
       <w:r>
         <w:rPr>
@@ -212,93 +259,27 @@
           <w:szCs w:val="30"/>
           <w:rtl/>
         </w:rPr>
-        <w:t xml:space="preserve"> שמחים להציג בפניכם את </w:t>
-      </w:r>
-      <w:r>
-        <w:rPr>
-          <w:rFonts w:ascii="Fb CoherentiSansEnHeb" w:hAnsi="Fb CoherentiSansEnHeb" w:cstheme="minorBidi" w:hint="cs"/>
-          <w:sz w:val="30"/>
-          <w:szCs w:val="30"/>
-          <w:rtl/>
-        </w:rPr>
-        <w:t xml:space="preserve">ההצעה להיכנס </w:t>
+        <w:t xml:space="preserve">שנועד לעשות עבורך פי-6 על הכסף תוך 15 שנה. התהליך הוא מרתון ולא ספרינט ומטרתו לתת לך את הכלים, הידע והפרקטיקה כדי להצליח להשיג את המטרה השאפתנית הזו </w:t>
       </w:r>
       <w:proofErr w:type="spellStart"/>
-      <w:r>
-        <w:rPr>
-          <w:rFonts w:ascii="Fb CoherentiSansEnHeb" w:hAnsi="Fb CoherentiSansEnHeb" w:cstheme="minorBidi" w:hint="cs"/>
-          <w:sz w:val="30"/>
-          <w:szCs w:val="30"/>
-          <w:rtl/>
-        </w:rPr>
-        <w:t>איתנו</w:t>
-      </w:r>
-      <w:proofErr w:type="spellEnd"/>
-      <w:r>
-        <w:rPr>
-          <w:rFonts w:ascii="Fb CoherentiSansEnHeb" w:hAnsi="Fb CoherentiSansEnHeb" w:cstheme="minorBidi" w:hint="cs"/>
-          <w:sz w:val="30"/>
-          <w:szCs w:val="30"/>
-          <w:rtl/>
-        </w:rPr>
-        <w:t xml:space="preserve"> לתהליך ה-</w:t>
-      </w:r>
       <w:r>
         <w:rPr>
           <w:rFonts w:ascii="Fb CoherentiSansEnHeb" w:hAnsi="Fb CoherentiSansEnHeb" w:cstheme="minorBidi"/>
           <w:sz w:val="30"/>
           <w:szCs w:val="30"/>
-        </w:rPr>
-        <w:t>P8</w:t>
-      </w:r>
-      <w:r>
-        <w:rPr>
-          <w:rFonts w:ascii="Fb CoherentiSansEnHeb" w:hAnsi="Fb CoherentiSansEnHeb" w:cstheme="minorBidi" w:hint="cs"/>
-          <w:sz w:val="30"/>
-          <w:szCs w:val="30"/>
-          <w:rtl/>
-        </w:rPr>
-        <w:t xml:space="preserve"> שנועד לעשות עבורכם פי-8 על הכסף תוך 15 שנה. התהליך הוא מרתון ולא ספרינט ומטרתו לתת לכם את הכלים, הידע והפרקטיקה כדי להצליח להשיג את המטרה השאפתנית הזו </w:t>
-      </w:r>
-      <w:proofErr w:type="spellStart"/>
-      <w:r>
-        <w:rPr>
-          <w:rFonts w:ascii="Fb CoherentiSansEnHeb" w:hAnsi="Fb CoherentiSansEnHeb" w:cstheme="minorBidi" w:hint="cs"/>
-          <w:sz w:val="30"/>
-          <w:szCs w:val="30"/>
           <w:rtl/>
         </w:rPr>
         <w:t>איתנו</w:t>
       </w:r>
       <w:proofErr w:type="spellEnd"/>
       <w:r>
-        <w:rPr>
-          <w:rFonts w:ascii="Fb CoherentiSansEnHeb" w:hAnsi="Fb CoherentiSansEnHeb" w:cstheme="minorBidi" w:hint="cs"/>
-          <w:sz w:val="30"/>
-          <w:szCs w:val="30"/>
-          <w:rtl/>
-        </w:rPr>
-        <w:t xml:space="preserve"> יד ביד.</w:t>
-      </w:r>
-    </w:p>
-    <w:p>
-      <w:pPr>
-        <w:ind w:left="594"/>
         <w:rPr>
           <w:rFonts w:ascii="Fb CoherentiSansEnHeb" w:hAnsi="Fb CoherentiSansEnHeb" w:cstheme="minorBidi"/>
           <w:sz w:val="30"/>
           <w:szCs w:val="30"/>
           <w:rtl/>
         </w:rPr>
-      </w:pPr>
-      <w:r>
-        <w:rPr>
-          <w:rFonts w:ascii="Fb CoherentiSansEnHeb" w:hAnsi="Fb CoherentiSansEnHeb" w:cstheme="minorBidi" w:hint="cs"/>
-          <w:sz w:val="30"/>
-          <w:szCs w:val="30"/>
-          <w:rtl/>
-        </w:rPr>
-        <w:t>בכדי שהתהליך יצליח, נצטרך לעבור יחדיו שתי שלבים:</w:t>
+        <w:t xml:space="preserve"> יד ביד</w:t>
       </w:r>
       <w:r>
         <w:rPr>
@@ -306,17 +287,46 @@
           <w:sz w:val="30"/>
           <w:szCs w:val="30"/>
         </w:rPr>
-        <w:t xml:space="preserve"> </w:t>
-      </w:r>
-      <w:r>
-        <w:rPr>
-          <w:rFonts w:ascii="Fb CoherentiSansEnHeb" w:hAnsi="Fb CoherentiSansEnHeb" w:cstheme="minorBidi" w:hint="cs"/>
+        <w:t>.</w:t>
+      </w:r>
+    </w:p>
+    <w:p>
+      <w:pPr>
+        <w:ind w:left="594"/>
+        <w:rPr>
+          <w:rFonts w:ascii="Fb CoherentiSansEnHeb" w:hAnsi="Fb CoherentiSansEnHeb" w:cstheme="minorBidi"/>
           <w:sz w:val="30"/>
           <w:szCs w:val="30"/>
-          <w:rtl/>
-        </w:rPr>
-        <w:t>בניית התשתית והיישום בפעול. כל אחד מהשלבים תלוי אחד בשני בכדי להביא אתכם לעשות פי 8 על הכסף.</w:t>
-      </w:r>
+        </w:rPr>
+      </w:pPr>
+      <w:r>
+        <w:rPr>
+          <w:rFonts w:ascii="Fb CoherentiSansEnHeb" w:hAnsi="Fb CoherentiSansEnHeb" w:cstheme="minorBidi"/>
+          <w:sz w:val="30"/>
+          <w:szCs w:val="30"/>
+          <w:rtl/>
+        </w:rPr>
+        <w:t>בכדי שהתהליך יצליח, נצטרך לעבור יחדיו שתי שלבים: בניית התשתית והיישום בפעול. כל אחד מהשלבים תלוי אחד בשני בכדי להביא אתכם לעשות פי 6 על הכסף</w:t>
+      </w:r>
+      <w:r>
+        <w:rPr>
+          <w:rFonts w:ascii="Fb CoherentiSansEnHeb" w:hAnsi="Fb CoherentiSansEnHeb" w:cstheme="minorBidi"/>
+          <w:sz w:val="30"/>
+          <w:szCs w:val="30"/>
+        </w:rPr>
+        <w:t>.</w:t>
+      </w:r>
+    </w:p>
+    <w:p>
+      <w:pPr>
+        <w:ind w:left="594"/>
+        <w:rPr>
+          <w:rFonts w:ascii="Fb CoherentiSansEnHeb" w:hAnsi="Fb CoherentiSansEnHeb" w:cstheme="minorBidi"/>
+          <w:sz w:val="30"/>
+          <w:szCs w:val="30"/>
+          <w:rtl/>
+        </w:rPr>
+      </w:pPr>
     </w:p>
     <w:p>
       <w:pPr>
@@ -359,7 +369,25 @@
           <w:szCs w:val="30"/>
           <w:rtl/>
         </w:rPr>
-        <w:t>נועד להגדת המטרות שלכם, ניהול הסיכונים שבדרך, תכנון העצמאית הכלכלית ובניית אסטרטגיית ההשקעות.</w:t>
+        <w:t xml:space="preserve">נועד להגדת המטרות </w:t>
+      </w:r>
+      <w:r>
+        <w:rPr>
+          <w:rFonts w:ascii="Fb CoherentiSansEnHeb" w:hAnsi="Fb CoherentiSansEnHeb" w:cstheme="minorBidi" w:hint="cs"/>
+          <w:sz w:val="30"/>
+          <w:szCs w:val="30"/>
+          <w:rtl/>
+        </w:rPr>
+        <w:t>שלך</w:t>
+      </w:r>
+      <w:r>
+        <w:rPr>
+          <w:rFonts w:ascii="Fb CoherentiSansEnHeb" w:hAnsi="Fb CoherentiSansEnHeb" w:cstheme="minorBidi"/>
+          <w:sz w:val="30"/>
+          <w:szCs w:val="30"/>
+          <w:rtl/>
+        </w:rPr>
+        <w:t>, ניהול הסיכונים שבדרך, תכנון העצמאית הכלכלית ובניית אסטרטגיית ההשקעות.</w:t>
       </w:r>
       <w:r>
         <w:rPr>
@@ -422,7 +450,25 @@
           <w:szCs w:val="30"/>
           <w:rtl/>
         </w:rPr>
-        <w:t>נועד לחשוף אתכם לשלל אפיקי ההשקעה שנרצה להשקיע בהם ברמת התאוריה, ההתנהלות הנכונה והיישום בפועל בפתיחת החשבונות, פגישות עם הגופים והקמת ההוראות והרשאות ליישום.</w:t>
+        <w:t xml:space="preserve">נועד לחשוף </w:t>
+      </w:r>
+      <w:r>
+        <w:rPr>
+          <w:rFonts w:ascii="Fb CoherentiSansEnHeb" w:hAnsi="Fb CoherentiSansEnHeb" w:cstheme="minorBidi" w:hint="cs"/>
+          <w:sz w:val="30"/>
+          <w:szCs w:val="30"/>
+          <w:rtl/>
+        </w:rPr>
+        <w:t>אותך</w:t>
+      </w:r>
+      <w:r>
+        <w:rPr>
+          <w:rFonts w:ascii="Fb CoherentiSansEnHeb" w:hAnsi="Fb CoherentiSansEnHeb" w:cstheme="minorBidi"/>
+          <w:sz w:val="30"/>
+          <w:szCs w:val="30"/>
+          <w:rtl/>
+        </w:rPr>
+        <w:t xml:space="preserve"> לשלל אפיקי ההשקעה שנרצה להשקיע בהם ברמת התאוריה, ההתנהלות הנכונה והיישום בפועל בפתיחת החשבונות, פגישות עם הגופים והקמת ההוראות והרשאות ליישום.</w:t>
       </w:r>
     </w:p>
     <w:p>
@@ -785,13 +831,11 @@
           <w:rFonts w:ascii="Fb CoherentiSansEnHeb Medium" w:hAnsi="Fb CoherentiSansEnHeb Medium" w:cstheme="majorBidi"/>
           <w:b/>
           <w:bCs/>
-          <w:sz w:val="36"/>
+          <w:sz w:val="30"/>
           <w:szCs w:val="30"/>
           <w:u w:val="single"/>
-          <w:rtl/>
-        </w:rPr>
-      </w:pPr>
-      <w:bookmarkStart w:id="0" w:name="_GoBack"/>
+        </w:rPr>
+      </w:pPr>
       <w:r>
         <w:rPr>
           <w:rFonts w:ascii="Fb CoherentiSansEnHeb Medium" w:hAnsi="Fb CoherentiSansEnHeb Medium" w:cstheme="majorBidi"/>
@@ -852,7 +896,1035 @@
         <w:t xml:space="preserve"> ₪</w:t>
       </w:r>
     </w:p>
-    <w:bookmarkEnd w:id="0"/>
+    <w:p>
+      <w:pPr>
+        <w:ind w:left="594"/>
+        <w:rPr>
+          <w:rFonts w:ascii="Fb CoherentiSansEnHeb Medium" w:hAnsi="Fb CoherentiSansEnHeb Medium" w:cstheme="majorBidi"/>
+          <w:b/>
+          <w:bCs/>
+          <w:sz w:val="30"/>
+          <w:szCs w:val="30"/>
+          <w:u w:val="single"/>
+        </w:rPr>
+      </w:pPr>
+    </w:p>
+    <w:p>
+      <w:pPr>
+        <w:ind w:left="594"/>
+        <w:rPr>
+          <w:rFonts w:ascii="Fb CoherentiSansEnHeb Medium" w:hAnsi="Fb CoherentiSansEnHeb Medium" w:cstheme="minorBidi"/>
+          <w:sz w:val="32"/>
+          <w:szCs w:val="32"/>
+          <w:rtl/>
+        </w:rPr>
+      </w:pPr>
+      <w:r>
+        <w:rPr>
+          <w:rFonts w:ascii="Fb CoherentiSansEnHeb Medium" w:hAnsi="Fb CoherentiSansEnHeb Medium" w:cstheme="majorBidi" w:hint="cs"/>
+          <w:b/>
+          <w:bCs/>
+          <w:sz w:val="32"/>
+          <w:szCs w:val="32"/>
+          <w:rtl/>
+        </w:rPr>
+        <w:t>משך הליווי</w:t>
+      </w:r>
+      <w:r>
+        <w:rPr>
+          <w:rFonts w:ascii="Fb CoherentiSansEnHeb Medium" w:hAnsi="Fb CoherentiSansEnHeb Medium" w:cstheme="majorBidi" w:hint="cs"/>
+          <w:sz w:val="32"/>
+          <w:szCs w:val="32"/>
+          <w:rtl/>
+        </w:rPr>
+        <w:t xml:space="preserve"> </w:t>
+      </w:r>
+      <w:r>
+        <w:rPr>
+          <w:rFonts w:ascii="Fb CoherentiSansEnHeb Medium" w:hAnsi="Fb CoherentiSansEnHeb Medium" w:cstheme="minorBidi" w:hint="cs"/>
+          <w:sz w:val="32"/>
+          <w:szCs w:val="32"/>
+          <w:rtl/>
+        </w:rPr>
+        <w:t>- התהליך יארך כ-8/9 חודשים עם ליווי מלא מהצד שלנו ביישום בפועל.</w:t>
+      </w:r>
+    </w:p>
+    <w:p>
+      <w:pPr>
+        <w:ind w:left="594"/>
+        <w:rPr>
+          <w:rFonts w:ascii="Fb CoherentiSansEnHeb Medium" w:hAnsi="Fb CoherentiSansEnHeb Medium" w:cstheme="minorBidi"/>
+          <w:sz w:val="32"/>
+          <w:szCs w:val="32"/>
+          <w:rtl/>
+        </w:rPr>
+      </w:pPr>
+      <w:r>
+        <w:rPr>
+          <w:rFonts w:ascii="Fb CoherentiSansEnHeb Medium" w:hAnsi="Fb CoherentiSansEnHeb Medium" w:cstheme="majorBidi" w:hint="cs"/>
+          <w:b/>
+          <w:bCs/>
+          <w:sz w:val="32"/>
+          <w:szCs w:val="32"/>
+          <w:rtl/>
+        </w:rPr>
+        <w:t>התמחור</w:t>
+      </w:r>
+      <w:r>
+        <w:rPr>
+          <w:rFonts w:ascii="Fb CoherentiSansEnHeb Medium" w:hAnsi="Fb CoherentiSansEnHeb Medium" w:cstheme="majorBidi" w:hint="cs"/>
+          <w:sz w:val="32"/>
+          <w:szCs w:val="32"/>
+          <w:rtl/>
+        </w:rPr>
+        <w:t xml:space="preserve"> </w:t>
+      </w:r>
+      <w:r>
+        <w:rPr>
+          <w:rFonts w:ascii="Fb CoherentiSansEnHeb Medium" w:hAnsi="Fb CoherentiSansEnHeb Medium" w:cstheme="majorBidi"/>
+          <w:sz w:val="32"/>
+          <w:szCs w:val="32"/>
+          <w:rtl/>
+        </w:rPr>
+        <w:t>–</w:t>
+      </w:r>
+      <w:r>
+        <w:rPr>
+          <w:rFonts w:ascii="Fb CoherentiSansEnHeb Medium" w:hAnsi="Fb CoherentiSansEnHeb Medium" w:cstheme="minorBidi" w:hint="cs"/>
+          <w:sz w:val="32"/>
+          <w:szCs w:val="32"/>
+          <w:rtl/>
+        </w:rPr>
+        <w:t xml:space="preserve"> אנחנו נתחשבן בכל חלק מחדש על השלב הבא, כלומר מתחילים בשלב בניית התשתית ומתחשבנים עליו, במידה ואתה מרוצה עוברים לשלב היישום בפועל ושוב לשלב הליווי המתמשך שהוא חודש בחודשו.</w:t>
+      </w:r>
+    </w:p>
+    <w:p>
+      <w:pPr>
+        <w:ind w:left="594"/>
+        <w:rPr>
+          <w:rFonts w:ascii="Fb CoherentiSansEnHeb Medium" w:hAnsi="Fb CoherentiSansEnHeb Medium" w:cstheme="minorBidi"/>
+          <w:sz w:val="32"/>
+          <w:szCs w:val="32"/>
+          <w:rtl/>
+        </w:rPr>
+      </w:pPr>
+      <w:r>
+        <w:rPr>
+          <w:rFonts w:ascii="Fb CoherentiSansEnHeb Medium" w:hAnsi="Fb CoherentiSansEnHeb Medium" w:cstheme="majorBidi" w:hint="cs"/>
+          <w:b/>
+          <w:bCs/>
+          <w:sz w:val="32"/>
+          <w:szCs w:val="32"/>
+          <w:rtl/>
+        </w:rPr>
+        <w:t>מספר אנשי מקצוע</w:t>
+      </w:r>
+      <w:r>
+        <w:rPr>
+          <w:rFonts w:ascii="Fb CoherentiSansEnHeb Medium" w:hAnsi="Fb CoherentiSansEnHeb Medium" w:cstheme="majorBidi" w:hint="cs"/>
+          <w:sz w:val="32"/>
+          <w:szCs w:val="32"/>
+          <w:rtl/>
+        </w:rPr>
+        <w:t xml:space="preserve"> </w:t>
+      </w:r>
+      <w:r>
+        <w:rPr>
+          <w:rFonts w:ascii="Fb CoherentiSansEnHeb Medium" w:hAnsi="Fb CoherentiSansEnHeb Medium" w:cstheme="minorBidi"/>
+          <w:sz w:val="32"/>
+          <w:szCs w:val="32"/>
+          <w:rtl/>
+        </w:rPr>
+        <w:t>–</w:t>
+      </w:r>
+      <w:r>
+        <w:rPr>
+          <w:rFonts w:ascii="Fb CoherentiSansEnHeb Medium" w:hAnsi="Fb CoherentiSansEnHeb Medium" w:cstheme="minorBidi" w:hint="cs"/>
+          <w:sz w:val="32"/>
+          <w:szCs w:val="32"/>
+          <w:rtl/>
+        </w:rPr>
+        <w:t xml:space="preserve"> לתהליך שלך יצטרפו כמה אנשי מקצוע על פי הצורך: </w:t>
+      </w:r>
+      <w:proofErr w:type="spellStart"/>
+      <w:r>
+        <w:rPr>
+          <w:rFonts w:ascii="Fb CoherentiSansEnHeb Medium" w:hAnsi="Fb CoherentiSansEnHeb Medium" w:cstheme="minorBidi" w:hint="cs"/>
+          <w:sz w:val="32"/>
+          <w:szCs w:val="32"/>
+          <w:rtl/>
+        </w:rPr>
+        <w:t>פאראפלנר</w:t>
+      </w:r>
+      <w:proofErr w:type="spellEnd"/>
+      <w:r>
+        <w:rPr>
+          <w:rFonts w:ascii="Fb CoherentiSansEnHeb Medium" w:hAnsi="Fb CoherentiSansEnHeb Medium" w:cstheme="minorBidi" w:hint="cs"/>
+          <w:sz w:val="32"/>
+          <w:szCs w:val="32"/>
+          <w:rtl/>
+        </w:rPr>
+        <w:t xml:space="preserve"> לבניית התכנית, סוכן ביטוח פנסיוני ליישום המסקנות בפנסיה וקרן השתלמות ובתיק </w:t>
+      </w:r>
+      <w:proofErr w:type="spellStart"/>
+      <w:r>
+        <w:rPr>
+          <w:rFonts w:ascii="Fb CoherentiSansEnHeb Medium" w:hAnsi="Fb CoherentiSansEnHeb Medium" w:cstheme="minorBidi" w:hint="cs"/>
+          <w:sz w:val="32"/>
+          <w:szCs w:val="32"/>
+          <w:rtl/>
+        </w:rPr>
+        <w:t>הביטוחי</w:t>
+      </w:r>
+      <w:proofErr w:type="spellEnd"/>
+      <w:r>
+        <w:rPr>
+          <w:rFonts w:ascii="Fb CoherentiSansEnHeb Medium" w:hAnsi="Fb CoherentiSansEnHeb Medium" w:cstheme="minorBidi" w:hint="cs"/>
+          <w:sz w:val="32"/>
+          <w:szCs w:val="32"/>
+          <w:rtl/>
+        </w:rPr>
+        <w:t>, יועץ השקעות לבחירת ניירות הערך וכמובן אני.</w:t>
+      </w:r>
+    </w:p>
+    <w:p>
+      <w:pPr>
+        <w:ind w:left="594"/>
+        <w:rPr>
+          <w:rFonts w:ascii="Fb CoherentiSansEnHeb Medium" w:hAnsi="Fb CoherentiSansEnHeb Medium" w:cstheme="minorBidi"/>
+          <w:sz w:val="32"/>
+          <w:szCs w:val="32"/>
+          <w:rtl/>
+        </w:rPr>
+      </w:pPr>
+      <w:r>
+        <w:rPr>
+          <w:rFonts w:ascii="Fb CoherentiSansEnHeb Medium" w:hAnsi="Fb CoherentiSansEnHeb Medium" w:cstheme="majorBidi" w:hint="cs"/>
+          <w:b/>
+          <w:bCs/>
+          <w:sz w:val="32"/>
+          <w:szCs w:val="32"/>
+          <w:rtl/>
+        </w:rPr>
+        <w:t>הליווי המתמשך</w:t>
+      </w:r>
+      <w:r>
+        <w:rPr>
+          <w:rFonts w:ascii="Fb CoherentiSansEnHeb Medium" w:hAnsi="Fb CoherentiSansEnHeb Medium" w:cstheme="minorBidi" w:hint="cs"/>
+          <w:b/>
+          <w:bCs/>
+          <w:sz w:val="32"/>
+          <w:szCs w:val="32"/>
+          <w:rtl/>
+        </w:rPr>
+        <w:t xml:space="preserve"> </w:t>
+      </w:r>
+      <w:r>
+        <w:rPr>
+          <w:rFonts w:ascii="Fb CoherentiSansEnHeb Medium" w:hAnsi="Fb CoherentiSansEnHeb Medium" w:cstheme="minorBidi"/>
+          <w:sz w:val="32"/>
+          <w:szCs w:val="32"/>
+          <w:rtl/>
+        </w:rPr>
+        <w:t>–</w:t>
+      </w:r>
+      <w:r>
+        <w:rPr>
+          <w:rFonts w:ascii="Fb CoherentiSansEnHeb Medium" w:hAnsi="Fb CoherentiSansEnHeb Medium" w:cstheme="minorBidi" w:hint="cs"/>
+          <w:sz w:val="32"/>
+          <w:szCs w:val="32"/>
+          <w:rtl/>
+        </w:rPr>
+        <w:t xml:space="preserve"> אחרי שנסיים את תהליך היישום בפועל, נעבור לליווי המתמשך שעובד בצורה הבאה.</w:t>
+      </w:r>
+    </w:p>
+    <w:p>
+      <w:pPr>
+        <w:ind w:left="594"/>
+        <w:rPr>
+          <w:rFonts w:ascii="Fb CoherentiSansEnHeb Medium" w:hAnsi="Fb CoherentiSansEnHeb Medium" w:cstheme="minorBidi"/>
+          <w:sz w:val="32"/>
+          <w:szCs w:val="32"/>
+          <w:rtl/>
+        </w:rPr>
+      </w:pPr>
+      <w:r>
+        <w:rPr>
+          <w:rFonts w:ascii="Fb CoherentiSansEnHeb Medium" w:hAnsi="Fb CoherentiSansEnHeb Medium" w:cstheme="minorBidi"/>
+          <w:sz w:val="32"/>
+          <w:szCs w:val="32"/>
+          <w:rtl/>
+        </w:rPr>
+        <w:t xml:space="preserve">1. פגישה </w:t>
+      </w:r>
+      <w:proofErr w:type="spellStart"/>
+      <w:r>
+        <w:rPr>
+          <w:rFonts w:ascii="Fb CoherentiSansEnHeb Medium" w:hAnsi="Fb CoherentiSansEnHeb Medium" w:cstheme="minorBidi" w:hint="cs"/>
+          <w:sz w:val="32"/>
+          <w:szCs w:val="32"/>
+          <w:rtl/>
+        </w:rPr>
+        <w:t>תקופית</w:t>
+      </w:r>
+      <w:proofErr w:type="spellEnd"/>
+      <w:r>
+        <w:rPr>
+          <w:rFonts w:ascii="Fb CoherentiSansEnHeb Medium" w:hAnsi="Fb CoherentiSansEnHeb Medium" w:cstheme="minorBidi" w:hint="cs"/>
+          <w:sz w:val="32"/>
+          <w:szCs w:val="32"/>
+          <w:rtl/>
+        </w:rPr>
+        <w:t>: רבעונית, חצי שנתית או שנתית בהתאם למורכבות התיק</w:t>
+      </w:r>
+      <w:r>
+        <w:rPr>
+          <w:rFonts w:ascii="Fb CoherentiSansEnHeb Medium" w:hAnsi="Fb CoherentiSansEnHeb Medium" w:cstheme="minorBidi"/>
+          <w:sz w:val="32"/>
+          <w:szCs w:val="32"/>
+          <w:rtl/>
+        </w:rPr>
+        <w:t>.</w:t>
+      </w:r>
+    </w:p>
+    <w:p>
+      <w:pPr>
+        <w:ind w:left="594"/>
+        <w:rPr>
+          <w:rFonts w:ascii="Fb CoherentiSansEnHeb Medium" w:hAnsi="Fb CoherentiSansEnHeb Medium" w:cstheme="minorBidi"/>
+          <w:sz w:val="32"/>
+          <w:szCs w:val="32"/>
+          <w:rtl/>
+        </w:rPr>
+      </w:pPr>
+      <w:r>
+        <w:rPr>
+          <w:rFonts w:ascii="Fb CoherentiSansEnHeb Medium" w:hAnsi="Fb CoherentiSansEnHeb Medium" w:cstheme="minorBidi"/>
+          <w:sz w:val="32"/>
+          <w:szCs w:val="32"/>
+          <w:rtl/>
+        </w:rPr>
+        <w:t>2. זמינות, תפעול ושירות לכל הבעיה תהיה או שאלה בין לבין.</w:t>
+      </w:r>
+    </w:p>
+    <w:p>
+      <w:pPr>
+        <w:ind w:left="594"/>
+        <w:rPr>
+          <w:rFonts w:ascii="Fb CoherentiSansEnHeb Medium" w:hAnsi="Fb CoherentiSansEnHeb Medium" w:cstheme="minorBidi"/>
+          <w:sz w:val="32"/>
+          <w:szCs w:val="32"/>
+          <w:rtl/>
+        </w:rPr>
+      </w:pPr>
+      <w:r>
+        <w:rPr>
+          <w:rFonts w:ascii="Fb CoherentiSansEnHeb Medium" w:hAnsi="Fb CoherentiSansEnHeb Medium" w:cstheme="minorBidi"/>
+          <w:sz w:val="32"/>
+          <w:szCs w:val="32"/>
+          <w:rtl/>
+        </w:rPr>
+        <w:t>3. גישה מתמשכת למערכת הדיגיטלית.</w:t>
+      </w:r>
+    </w:p>
+    <w:p>
+      <w:pPr>
+        <w:ind w:left="594"/>
+        <w:rPr>
+          <w:rFonts w:ascii="Fb CoherentiSansEnHeb Medium" w:hAnsi="Fb CoherentiSansEnHeb Medium" w:cstheme="minorBidi"/>
+          <w:sz w:val="32"/>
+          <w:szCs w:val="32"/>
+          <w:rtl/>
+        </w:rPr>
+      </w:pPr>
+    </w:p>
+    <w:p>
+      <w:pPr>
+        <w:ind w:left="594"/>
+        <w:rPr>
+          <w:rFonts w:ascii="Fb CoherentiSansEnHeb Medium" w:hAnsi="Fb CoherentiSansEnHeb Medium" w:cstheme="minorBidi"/>
+          <w:sz w:val="32"/>
+          <w:szCs w:val="32"/>
+          <w:rtl/>
+        </w:rPr>
+      </w:pPr>
+    </w:p>
+    <w:p>
+      <w:pPr>
+        <w:ind w:left="594"/>
+        <w:rPr>
+          <w:rFonts w:ascii="Fb CoherentiSansEnHeb Medium" w:hAnsi="Fb CoherentiSansEnHeb Medium" w:cstheme="minorBidi"/>
+          <w:sz w:val="32"/>
+          <w:szCs w:val="32"/>
+          <w:rtl/>
+        </w:rPr>
+      </w:pPr>
+      <w:r>
+        <w:rPr>
+          <w:rFonts w:ascii="Fb CoherentiSansEnHeb Medium" w:hAnsi="Fb CoherentiSansEnHeb Medium" w:cstheme="minorBidi"/>
+          <w:sz w:val="32"/>
+          <w:szCs w:val="32"/>
+          <w:rtl/>
+        </w:rPr>
+        <w:t>4. השתתפות בהרצאות, כנסים ותכנים של החברה.</w:t>
+      </w:r>
+    </w:p>
+    <w:p>
+      <w:pPr>
+        <w:ind w:left="594"/>
+        <w:rPr>
+          <w:rFonts w:ascii="Fb CoherentiSansEnHeb Medium" w:hAnsi="Fb CoherentiSansEnHeb Medium" w:cstheme="minorBidi"/>
+          <w:sz w:val="32"/>
+          <w:szCs w:val="32"/>
+          <w:rtl/>
+        </w:rPr>
+      </w:pPr>
+      <w:r>
+        <w:rPr>
+          <w:rFonts w:ascii="Fb CoherentiSansEnHeb Medium" w:hAnsi="Fb CoherentiSansEnHeb Medium" w:cstheme="minorBidi"/>
+          <w:sz w:val="32"/>
+          <w:szCs w:val="32"/>
+          <w:rtl/>
+        </w:rPr>
+        <w:t xml:space="preserve">5. מעקב אחרי התיק </w:t>
+      </w:r>
+      <w:r>
+        <w:rPr>
+          <w:rFonts w:ascii="Fb CoherentiSansEnHeb Medium" w:hAnsi="Fb CoherentiSansEnHeb Medium" w:cstheme="minorBidi" w:hint="cs"/>
+          <w:sz w:val="32"/>
+          <w:szCs w:val="32"/>
+          <w:rtl/>
+        </w:rPr>
+        <w:t>שלך</w:t>
+      </w:r>
+      <w:r>
+        <w:rPr>
+          <w:rFonts w:ascii="Fb CoherentiSansEnHeb Medium" w:hAnsi="Fb CoherentiSansEnHeb Medium" w:cstheme="minorBidi"/>
+          <w:sz w:val="32"/>
+          <w:szCs w:val="32"/>
+          <w:rtl/>
+        </w:rPr>
+        <w:t xml:space="preserve"> בשוטף ועדכון בהתאם לצורך.</w:t>
+      </w:r>
+    </w:p>
+    <w:p>
+      <w:pPr>
+        <w:ind w:left="594"/>
+        <w:rPr>
+          <w:rFonts w:ascii="Fb CoherentiSansEnHeb Medium" w:hAnsi="Fb CoherentiSansEnHeb Medium" w:cstheme="minorBidi"/>
+          <w:sz w:val="32"/>
+          <w:szCs w:val="32"/>
+          <w:rtl/>
+        </w:rPr>
+      </w:pPr>
+      <w:r>
+        <w:rPr>
+          <w:rFonts w:ascii="Fb CoherentiSansEnHeb Medium" w:hAnsi="Fb CoherentiSansEnHeb Medium" w:cstheme="minorBidi"/>
+          <w:sz w:val="32"/>
+          <w:szCs w:val="32"/>
+          <w:rtl/>
+        </w:rPr>
+        <w:t xml:space="preserve">6. </w:t>
+      </w:r>
+      <w:proofErr w:type="spellStart"/>
+      <w:r>
+        <w:rPr>
+          <w:rFonts w:ascii="Fb CoherentiSansEnHeb Medium" w:hAnsi="Fb CoherentiSansEnHeb Medium" w:cstheme="minorBidi"/>
+          <w:sz w:val="32"/>
+          <w:szCs w:val="32"/>
+          <w:rtl/>
+        </w:rPr>
+        <w:t>איזור</w:t>
+      </w:r>
+      <w:proofErr w:type="spellEnd"/>
+      <w:r>
+        <w:rPr>
+          <w:rFonts w:ascii="Fb CoherentiSansEnHeb Medium" w:hAnsi="Fb CoherentiSansEnHeb Medium" w:cstheme="minorBidi"/>
+          <w:sz w:val="32"/>
+          <w:szCs w:val="32"/>
+          <w:rtl/>
+        </w:rPr>
+        <w:t xml:space="preserve"> אישי למעקב אחרי כל הנכסים </w:t>
+      </w:r>
+      <w:r>
+        <w:rPr>
+          <w:rFonts w:ascii="Fb CoherentiSansEnHeb Medium" w:hAnsi="Fb CoherentiSansEnHeb Medium" w:cstheme="minorBidi" w:hint="cs"/>
+          <w:sz w:val="32"/>
+          <w:szCs w:val="32"/>
+          <w:rtl/>
+        </w:rPr>
+        <w:t>שלך</w:t>
+      </w:r>
+      <w:r>
+        <w:rPr>
+          <w:rFonts w:ascii="Fb CoherentiSansEnHeb Medium" w:hAnsi="Fb CoherentiSansEnHeb Medium" w:cstheme="minorBidi"/>
+          <w:sz w:val="32"/>
+          <w:szCs w:val="32"/>
+          <w:rtl/>
+        </w:rPr>
+        <w:t xml:space="preserve"> במקום אחד.</w:t>
+      </w:r>
+    </w:p>
+    <w:p>
+      <w:pPr>
+        <w:ind w:left="594"/>
+        <w:rPr>
+          <w:rFonts w:ascii="Fb CoherentiSansEnHeb Medium" w:hAnsi="Fb CoherentiSansEnHeb Medium" w:cstheme="minorBidi"/>
+          <w:sz w:val="32"/>
+          <w:szCs w:val="32"/>
+          <w:rtl/>
+        </w:rPr>
+      </w:pPr>
+      <w:r>
+        <w:rPr>
+          <w:rFonts w:ascii="Fb CoherentiSansEnHeb Medium" w:hAnsi="Fb CoherentiSansEnHeb Medium" w:cstheme="minorBidi" w:hint="cs"/>
+          <w:sz w:val="32"/>
+          <w:szCs w:val="32"/>
+          <w:rtl/>
+        </w:rPr>
+        <w:t>העלות של הליווי המתמשך נגבית חודש בחודשו, ללא התחייבות כ-</w:t>
+      </w:r>
+      <w:r>
+        <w:rPr>
+          <w:rFonts w:ascii="Fb CoherentiSansEnHeb Medium" w:hAnsi="Fb CoherentiSansEnHeb Medium" w:cstheme="minorBidi"/>
+          <w:sz w:val="32"/>
+          <w:szCs w:val="32"/>
+        </w:rPr>
+        <w:t xml:space="preserve">WIN </w:t>
+      </w:r>
+      <w:proofErr w:type="spellStart"/>
+      <w:r>
+        <w:rPr>
+          <w:rFonts w:ascii="Fb CoherentiSansEnHeb Medium" w:hAnsi="Fb CoherentiSansEnHeb Medium" w:cstheme="minorBidi"/>
+          <w:sz w:val="32"/>
+          <w:szCs w:val="32"/>
+        </w:rPr>
+        <w:t>WIN</w:t>
+      </w:r>
+      <w:proofErr w:type="spellEnd"/>
+      <w:r>
+        <w:rPr>
+          <w:rFonts w:ascii="Fb CoherentiSansEnHeb Medium" w:hAnsi="Fb CoherentiSansEnHeb Medium" w:cstheme="minorBidi" w:hint="cs"/>
+          <w:sz w:val="32"/>
+          <w:szCs w:val="32"/>
+          <w:rtl/>
+        </w:rPr>
+        <w:t>, כלומר כל עוד אתה מרוצה מהשירות והתוצאות אנחנו רצים ביחד וברגע שלא מפסיקים.</w:t>
+      </w:r>
+    </w:p>
+    <w:p>
+      <w:pPr>
+        <w:ind w:left="594"/>
+        <w:rPr>
+          <w:rFonts w:ascii="Fb CoherentiSansEnHeb Medium" w:hAnsi="Fb CoherentiSansEnHeb Medium" w:cstheme="minorBidi"/>
+          <w:sz w:val="32"/>
+          <w:szCs w:val="32"/>
+          <w:rtl/>
+        </w:rPr>
+      </w:pPr>
+    </w:p>
+    <w:p>
+      <w:pPr>
+        <w:ind w:left="594"/>
+        <w:rPr>
+          <w:rFonts w:ascii="Fb CoherentiSansEnHeb Medium" w:hAnsi="Fb CoherentiSansEnHeb Medium" w:cstheme="majorBidi"/>
+          <w:b/>
+          <w:bCs/>
+          <w:sz w:val="32"/>
+          <w:szCs w:val="32"/>
+          <w:rtl/>
+        </w:rPr>
+      </w:pPr>
+      <w:proofErr w:type="spellStart"/>
+      <w:r>
+        <w:rPr>
+          <w:rFonts w:ascii="Fb CoherentiSansEnHeb Medium" w:hAnsi="Fb CoherentiSansEnHeb Medium" w:cstheme="majorBidi"/>
+          <w:b/>
+          <w:bCs/>
+          <w:sz w:val="32"/>
+          <w:szCs w:val="32"/>
+          <w:rtl/>
+        </w:rPr>
+        <w:t>בנתיים</w:t>
+      </w:r>
+      <w:proofErr w:type="spellEnd"/>
+      <w:r>
+        <w:rPr>
+          <w:rFonts w:ascii="Fb CoherentiSansEnHeb Medium" w:hAnsi="Fb CoherentiSansEnHeb Medium" w:cstheme="majorBidi"/>
+          <w:b/>
+          <w:bCs/>
+          <w:sz w:val="32"/>
+          <w:szCs w:val="32"/>
+          <w:rtl/>
+        </w:rPr>
+        <w:t xml:space="preserve"> מצרף </w:t>
+      </w:r>
+      <w:r>
+        <w:rPr>
+          <w:rFonts w:ascii="Fb CoherentiSansEnHeb Medium" w:hAnsi="Fb CoherentiSansEnHeb Medium" w:cstheme="majorBidi" w:hint="cs"/>
+          <w:b/>
+          <w:bCs/>
+          <w:sz w:val="32"/>
+          <w:szCs w:val="32"/>
+          <w:rtl/>
+        </w:rPr>
+        <w:t>לך</w:t>
+      </w:r>
+      <w:r>
+        <w:rPr>
+          <w:rFonts w:ascii="Fb CoherentiSansEnHeb Medium" w:hAnsi="Fb CoherentiSansEnHeb Medium" w:cstheme="majorBidi"/>
+          <w:b/>
+          <w:bCs/>
+          <w:sz w:val="32"/>
+          <w:szCs w:val="32"/>
+          <w:rtl/>
+        </w:rPr>
+        <w:t xml:space="preserve"> עוד קצת מידע עלינו ועלי:</w:t>
+      </w:r>
+    </w:p>
+    <w:p>
+      <w:pPr>
+        <w:ind w:left="594"/>
+        <w:rPr>
+          <w:rFonts w:ascii="Fb CoherentiSansEnHeb Medium" w:hAnsi="Fb CoherentiSansEnHeb Medium" w:cstheme="minorBidi"/>
+          <w:sz w:val="32"/>
+          <w:szCs w:val="32"/>
+          <w:rtl/>
+        </w:rPr>
+      </w:pPr>
+      <w:r>
+        <w:rPr>
+          <w:rFonts w:ascii="Fb CoherentiSansEnHeb Medium" w:hAnsi="Fb CoherentiSansEnHeb Medium" w:cstheme="minorBidi"/>
+          <w:sz w:val="32"/>
+          <w:szCs w:val="32"/>
+          <w:rtl/>
+        </w:rPr>
+        <w:t xml:space="preserve">1. קישור לאתר שלנו: </w:t>
+      </w:r>
+      <w:hyperlink r:id="rId9" w:history="1">
+        <w:r>
+          <w:rPr>
+            <w:rStyle w:val="Hyperlink"/>
+            <w:rFonts w:ascii="Fb CoherentiSansEnHeb Medium" w:hAnsi="Fb CoherentiSansEnHeb Medium" w:cstheme="minorBidi"/>
+            <w:sz w:val="32"/>
+            <w:szCs w:val="32"/>
+          </w:rPr>
+          <w:t>https://www.financialplanning.co.il</w:t>
+        </w:r>
+        <w:r>
+          <w:rPr>
+            <w:rStyle w:val="Hyperlink"/>
+            <w:rFonts w:ascii="Fb CoherentiSansEnHeb Medium" w:hAnsi="Fb CoherentiSansEnHeb Medium" w:cstheme="minorBidi"/>
+            <w:sz w:val="32"/>
+            <w:szCs w:val="32"/>
+            <w:rtl/>
+          </w:rPr>
+          <w:t>/</w:t>
+        </w:r>
+      </w:hyperlink>
+      <w:r>
+        <w:rPr>
+          <w:rFonts w:ascii="Fb CoherentiSansEnHeb Medium" w:hAnsi="Fb CoherentiSansEnHeb Medium" w:cstheme="minorBidi" w:hint="cs"/>
+          <w:sz w:val="32"/>
+          <w:szCs w:val="32"/>
+          <w:rtl/>
+        </w:rPr>
+        <w:t xml:space="preserve"> </w:t>
+      </w:r>
+    </w:p>
+    <w:p>
+      <w:pPr>
+        <w:ind w:left="594"/>
+        <w:rPr>
+          <w:rFonts w:ascii="Fb CoherentiSansEnHeb Medium" w:hAnsi="Fb CoherentiSansEnHeb Medium" w:cstheme="minorBidi"/>
+          <w:sz w:val="32"/>
+          <w:szCs w:val="32"/>
+          <w:rtl/>
+        </w:rPr>
+      </w:pPr>
+      <w:r>
+        <w:rPr>
+          <w:rFonts w:ascii="Fb CoherentiSansEnHeb Medium" w:hAnsi="Fb CoherentiSansEnHeb Medium" w:cstheme="minorBidi"/>
+          <w:sz w:val="32"/>
+          <w:szCs w:val="32"/>
+          <w:rtl/>
+        </w:rPr>
+        <w:t xml:space="preserve">2. קישור לדף אודותינו: </w:t>
+      </w:r>
+      <w:hyperlink r:id="rId10" w:history="1">
+        <w:r>
+          <w:rPr>
+            <w:rStyle w:val="Hyperlink"/>
+            <w:rFonts w:ascii="Fb CoherentiSansEnHeb Medium" w:hAnsi="Fb CoherentiSansEnHeb Medium" w:cstheme="minorBidi"/>
+            <w:sz w:val="32"/>
+            <w:szCs w:val="32"/>
+          </w:rPr>
+          <w:t>https://www.financialplanning.co.il/about-us</w:t>
+        </w:r>
+        <w:r>
+          <w:rPr>
+            <w:rStyle w:val="Hyperlink"/>
+            <w:rFonts w:ascii="Fb CoherentiSansEnHeb Medium" w:hAnsi="Fb CoherentiSansEnHeb Medium" w:cstheme="minorBidi"/>
+            <w:sz w:val="32"/>
+            <w:szCs w:val="32"/>
+            <w:rtl/>
+          </w:rPr>
+          <w:t>/</w:t>
+        </w:r>
+      </w:hyperlink>
+      <w:r>
+        <w:rPr>
+          <w:rFonts w:ascii="Fb CoherentiSansEnHeb Medium" w:hAnsi="Fb CoherentiSansEnHeb Medium" w:cstheme="minorBidi" w:hint="cs"/>
+          <w:sz w:val="32"/>
+          <w:szCs w:val="32"/>
+          <w:rtl/>
+        </w:rPr>
+        <w:t xml:space="preserve"> </w:t>
+      </w:r>
+    </w:p>
+    <w:p>
+      <w:pPr>
+        <w:ind w:left="594"/>
+        <w:rPr>
+          <w:rFonts w:ascii="Fb CoherentiSansEnHeb Medium" w:hAnsi="Fb CoherentiSansEnHeb Medium" w:cstheme="minorBidi"/>
+          <w:sz w:val="32"/>
+          <w:szCs w:val="32"/>
+          <w:rtl/>
+        </w:rPr>
+      </w:pPr>
+      <w:r>
+        <w:rPr>
+          <w:rFonts w:ascii="Fb CoherentiSansEnHeb Medium" w:hAnsi="Fb CoherentiSansEnHeb Medium" w:cstheme="minorBidi"/>
+          <w:sz w:val="32"/>
+          <w:szCs w:val="32"/>
+          <w:rtl/>
+        </w:rPr>
+        <w:t xml:space="preserve">3. קישור לדף ההמלצות: </w:t>
+      </w:r>
+      <w:hyperlink r:id="rId11" w:history="1">
+        <w:r>
+          <w:rPr>
+            <w:rStyle w:val="Hyperlink"/>
+            <w:rFonts w:ascii="Fb CoherentiSansEnHeb Medium" w:hAnsi="Fb CoherentiSansEnHeb Medium" w:cstheme="minorBidi"/>
+            <w:sz w:val="32"/>
+            <w:szCs w:val="32"/>
+          </w:rPr>
+          <w:t>https://www.financialplanning.co.il/reviews</w:t>
+        </w:r>
+        <w:r>
+          <w:rPr>
+            <w:rStyle w:val="Hyperlink"/>
+            <w:rFonts w:ascii="Fb CoherentiSansEnHeb Medium" w:hAnsi="Fb CoherentiSansEnHeb Medium" w:cstheme="minorBidi"/>
+            <w:sz w:val="32"/>
+            <w:szCs w:val="32"/>
+            <w:rtl/>
+          </w:rPr>
+          <w:t>/</w:t>
+        </w:r>
+      </w:hyperlink>
+    </w:p>
+    <w:p>
+      <w:pPr>
+        <w:ind w:left="594"/>
+        <w:rPr>
+          <w:rFonts w:ascii="Fb CoherentiSansEnHeb Medium" w:hAnsi="Fb CoherentiSansEnHeb Medium" w:cstheme="minorBidi"/>
+          <w:sz w:val="32"/>
+          <w:szCs w:val="32"/>
+          <w:rtl/>
+        </w:rPr>
+      </w:pPr>
+      <w:r>
+        <w:rPr>
+          <w:rFonts w:ascii="Fb CoherentiSansEnHeb Medium" w:hAnsi="Fb CoherentiSansEnHeb Medium" w:cstheme="minorBidi" w:hint="cs"/>
+          <w:sz w:val="32"/>
+          <w:szCs w:val="32"/>
+          <w:rtl/>
+        </w:rPr>
+        <w:t xml:space="preserve">4. </w:t>
+      </w:r>
+      <w:proofErr w:type="spellStart"/>
+      <w:r>
+        <w:rPr>
+          <w:rFonts w:ascii="Fb CoherentiSansEnHeb Medium" w:hAnsi="Fb CoherentiSansEnHeb Medium" w:cstheme="minorBidi"/>
+          <w:sz w:val="32"/>
+          <w:szCs w:val="32"/>
+          <w:rtl/>
+        </w:rPr>
+        <w:t>כלכליסט</w:t>
+      </w:r>
+      <w:proofErr w:type="spellEnd"/>
+      <w:r>
+        <w:rPr>
+          <w:rFonts w:ascii="Fb CoherentiSansEnHeb Medium" w:hAnsi="Fb CoherentiSansEnHeb Medium" w:cstheme="minorBidi"/>
+          <w:sz w:val="32"/>
+          <w:szCs w:val="32"/>
+          <w:rtl/>
+        </w:rPr>
+        <w:t xml:space="preserve"> בחרו בי </w:t>
+      </w:r>
+      <w:r>
+        <w:rPr>
+          <w:rFonts w:ascii="Fb CoherentiSansEnHeb Medium" w:hAnsi="Fb CoherentiSansEnHeb Medium" w:cstheme="minorBidi" w:hint="cs"/>
+          <w:sz w:val="32"/>
+          <w:szCs w:val="32"/>
+          <w:rtl/>
+        </w:rPr>
+        <w:t>ליצור עבורם</w:t>
+      </w:r>
+      <w:r>
+        <w:rPr>
+          <w:rFonts w:ascii="Fb CoherentiSansEnHeb Medium" w:hAnsi="Fb CoherentiSansEnHeb Medium" w:cstheme="minorBidi"/>
+          <w:sz w:val="32"/>
+          <w:szCs w:val="32"/>
+          <w:rtl/>
+        </w:rPr>
+        <w:t xml:space="preserve"> קורס תכנון פיננסי:</w:t>
+      </w:r>
+    </w:p>
+    <w:p>
+      <w:pPr>
+        <w:bidi w:val="0"/>
+        <w:ind w:left="594"/>
+        <w:rPr>
+          <w:rFonts w:ascii="Fb CoherentiSansEnHeb Medium" w:hAnsi="Fb CoherentiSansEnHeb Medium" w:cstheme="minorBidi"/>
+          <w:sz w:val="32"/>
+          <w:szCs w:val="32"/>
+          <w:rtl/>
+        </w:rPr>
+      </w:pPr>
+      <w:hyperlink r:id="rId12" w:history="1">
+        <w:r>
+          <w:rPr>
+            <w:rStyle w:val="Hyperlink"/>
+            <w:rFonts w:ascii="Fb CoherentiSansEnHeb Medium" w:hAnsi="Fb CoherentiSansEnHeb Medium" w:cstheme="minorBidi"/>
+            <w:sz w:val="32"/>
+            <w:szCs w:val="32"/>
+          </w:rPr>
+          <w:t>https://study.calcalist.co.il/courses/</w:t>
+        </w:r>
+        <w:r>
+          <w:rPr>
+            <w:rStyle w:val="Hyperlink"/>
+            <w:rFonts w:ascii="Fb CoherentiSansEnHeb Medium" w:hAnsi="Fb CoherentiSansEnHeb Medium" w:cstheme="minorBidi" w:hint="cs"/>
+            <w:sz w:val="32"/>
+            <w:szCs w:val="32"/>
+            <w:rtl/>
+          </w:rPr>
+          <w:t>מתכננים-עתיד</w:t>
+        </w:r>
+        <w:r>
+          <w:rPr>
+            <w:rStyle w:val="Hyperlink"/>
+            <w:rFonts w:ascii="Fb CoherentiSansEnHeb Medium" w:hAnsi="Fb CoherentiSansEnHeb Medium" w:cstheme="minorBidi"/>
+            <w:sz w:val="32"/>
+            <w:szCs w:val="32"/>
+          </w:rPr>
+          <w:t>-/about</w:t>
+        </w:r>
+        <w:r>
+          <w:rPr>
+            <w:rStyle w:val="Hyperlink"/>
+            <w:rFonts w:ascii="Fb CoherentiSansEnHeb Medium" w:hAnsi="Fb CoherentiSansEnHeb Medium" w:cstheme="minorBidi"/>
+            <w:sz w:val="32"/>
+            <w:szCs w:val="32"/>
+            <w:rtl/>
+          </w:rPr>
+          <w:t>/</w:t>
+        </w:r>
+      </w:hyperlink>
+    </w:p>
+    <w:p>
+      <w:pPr>
+        <w:ind w:left="594"/>
+        <w:rPr>
+          <w:rFonts w:ascii="Fb CoherentiSansEnHeb Medium" w:hAnsi="Fb CoherentiSansEnHeb Medium" w:cstheme="minorBidi"/>
+          <w:sz w:val="32"/>
+          <w:szCs w:val="32"/>
+          <w:rtl/>
+        </w:rPr>
+      </w:pPr>
+      <w:r>
+        <w:rPr>
+          <w:rFonts w:ascii="Fb CoherentiSansEnHeb Medium" w:hAnsi="Fb CoherentiSansEnHeb Medium" w:cstheme="minorBidi"/>
+          <w:sz w:val="32"/>
+          <w:szCs w:val="32"/>
+          <w:rtl/>
+        </w:rPr>
+        <w:t xml:space="preserve">5. כתבה שעשו עלי בגלובס: </w:t>
+      </w:r>
+      <w:hyperlink r:id="rId13" w:history="1">
+        <w:r>
+          <w:rPr>
+            <w:rStyle w:val="Hyperlink"/>
+            <w:rFonts w:ascii="Fb CoherentiSansEnHeb Medium" w:hAnsi="Fb CoherentiSansEnHeb Medium" w:cstheme="minorBidi"/>
+            <w:sz w:val="32"/>
+            <w:szCs w:val="32"/>
+          </w:rPr>
+          <w:t>https://www.globes.co.il/news/article.aspx?did=1001424990</w:t>
+        </w:r>
+      </w:hyperlink>
+      <w:r>
+        <w:rPr>
+          <w:rFonts w:ascii="Fb CoherentiSansEnHeb Medium" w:hAnsi="Fb CoherentiSansEnHeb Medium" w:cstheme="minorBidi" w:hint="cs"/>
+          <w:sz w:val="32"/>
+          <w:szCs w:val="32"/>
+          <w:rtl/>
+        </w:rPr>
+        <w:t xml:space="preserve"> </w:t>
+      </w:r>
+    </w:p>
+    <w:p>
+      <w:pPr>
+        <w:ind w:left="594"/>
+        <w:rPr>
+          <w:rFonts w:ascii="Fb CoherentiSansEnHeb Medium" w:hAnsi="Fb CoherentiSansEnHeb Medium" w:cstheme="minorBidi"/>
+          <w:sz w:val="32"/>
+          <w:szCs w:val="32"/>
+          <w:rtl/>
+        </w:rPr>
+      </w:pPr>
+      <w:r>
+        <w:rPr>
+          <w:rFonts w:ascii="Fb CoherentiSansEnHeb Medium" w:hAnsi="Fb CoherentiSansEnHeb Medium" w:cstheme="minorBidi"/>
+          <w:sz w:val="32"/>
+          <w:szCs w:val="32"/>
+          <w:rtl/>
+        </w:rPr>
+        <w:t xml:space="preserve">6. נבחרתי למתכנן הפיננסי של השנה (2024): </w:t>
+      </w:r>
+      <w:hyperlink r:id="rId14" w:history="1">
+        <w:r>
+          <w:rPr>
+            <w:rStyle w:val="Hyperlink"/>
+            <w:rFonts w:ascii="Fb CoherentiSansEnHeb Medium" w:hAnsi="Fb CoherentiSansEnHeb Medium" w:cstheme="minorBidi"/>
+            <w:sz w:val="32"/>
+            <w:szCs w:val="32"/>
+          </w:rPr>
+          <w:t>https://www.youtube.com/watch?v=Fpb8XKrciyw</w:t>
+        </w:r>
+      </w:hyperlink>
+      <w:r>
+        <w:rPr>
+          <w:rFonts w:ascii="Fb CoherentiSansEnHeb Medium" w:hAnsi="Fb CoherentiSansEnHeb Medium" w:cstheme="minorBidi" w:hint="cs"/>
+          <w:sz w:val="32"/>
+          <w:szCs w:val="32"/>
+          <w:rtl/>
+        </w:rPr>
+        <w:t xml:space="preserve"> </w:t>
+      </w:r>
+    </w:p>
+    <w:p>
+      <w:pPr>
+        <w:ind w:left="594"/>
+        <w:rPr>
+          <w:rFonts w:ascii="Fb CoherentiSansEnHeb Medium" w:hAnsi="Fb CoherentiSansEnHeb Medium" w:cstheme="minorBidi"/>
+          <w:sz w:val="32"/>
+          <w:szCs w:val="32"/>
+          <w:rtl/>
+        </w:rPr>
+      </w:pPr>
+    </w:p>
+    <w:p>
+      <w:pPr>
+        <w:ind w:left="594"/>
+        <w:rPr>
+          <w:rFonts w:ascii="Fb CoherentiSansEnHeb Medium" w:hAnsi="Fb CoherentiSansEnHeb Medium" w:cstheme="minorBidi"/>
+          <w:sz w:val="32"/>
+          <w:szCs w:val="32"/>
+          <w:rtl/>
+        </w:rPr>
+      </w:pPr>
+      <w:r>
+        <w:rPr>
+          <w:rFonts w:ascii="Fb CoherentiSansEnHeb Medium" w:hAnsi="Fb CoherentiSansEnHeb Medium" w:cstheme="minorBidi"/>
+          <w:sz w:val="32"/>
+          <w:szCs w:val="32"/>
+          <w:rtl/>
+        </w:rPr>
+        <w:t>את</w:t>
+      </w:r>
+      <w:r>
+        <w:rPr>
+          <w:rFonts w:ascii="Fb CoherentiSansEnHeb Medium" w:hAnsi="Fb CoherentiSansEnHeb Medium" w:cstheme="minorBidi" w:hint="cs"/>
+          <w:sz w:val="32"/>
+          <w:szCs w:val="32"/>
+          <w:rtl/>
+        </w:rPr>
+        <w:t>ה</w:t>
+      </w:r>
+      <w:r>
+        <w:rPr>
+          <w:rFonts w:ascii="Fb CoherentiSansEnHeb Medium" w:hAnsi="Fb CoherentiSansEnHeb Medium" w:cstheme="minorBidi"/>
+          <w:sz w:val="32"/>
+          <w:szCs w:val="32"/>
+          <w:rtl/>
+        </w:rPr>
+        <w:t xml:space="preserve"> גם מוזמנים לחפש עלי בגוגל "אריאל </w:t>
+      </w:r>
+      <w:proofErr w:type="spellStart"/>
+      <w:r>
+        <w:rPr>
+          <w:rFonts w:ascii="Fb CoherentiSansEnHeb Medium" w:hAnsi="Fb CoherentiSansEnHeb Medium" w:cstheme="minorBidi"/>
+          <w:sz w:val="32"/>
+          <w:szCs w:val="32"/>
+          <w:rtl/>
+        </w:rPr>
+        <w:t>אזואלוס</w:t>
+      </w:r>
+      <w:proofErr w:type="spellEnd"/>
+      <w:r>
+        <w:rPr>
+          <w:rFonts w:ascii="Fb CoherentiSansEnHeb Medium" w:hAnsi="Fb CoherentiSansEnHeb Medium" w:cstheme="minorBidi"/>
+          <w:sz w:val="32"/>
+          <w:szCs w:val="32"/>
+          <w:rtl/>
+        </w:rPr>
+        <w:t>", בטוח שיעשה ל</w:t>
+      </w:r>
+      <w:r>
+        <w:rPr>
+          <w:rFonts w:ascii="Fb CoherentiSansEnHeb Medium" w:hAnsi="Fb CoherentiSansEnHeb Medium" w:cstheme="minorBidi" w:hint="cs"/>
+          <w:sz w:val="32"/>
+          <w:szCs w:val="32"/>
+          <w:rtl/>
+        </w:rPr>
+        <w:t>ך</w:t>
+      </w:r>
+      <w:r>
+        <w:rPr>
+          <w:rFonts w:ascii="Fb CoherentiSansEnHeb Medium" w:hAnsi="Fb CoherentiSansEnHeb Medium" w:cstheme="minorBidi"/>
+          <w:sz w:val="32"/>
+          <w:szCs w:val="32"/>
+          <w:rtl/>
+        </w:rPr>
+        <w:t xml:space="preserve"> טוב.</w:t>
+      </w:r>
+    </w:p>
+    <w:p>
+      <w:pPr>
+        <w:ind w:left="594"/>
+        <w:rPr>
+          <w:rFonts w:ascii="Fb CoherentiSansEnHeb Medium" w:hAnsi="Fb CoherentiSansEnHeb Medium" w:cstheme="majorBidi"/>
+          <w:b/>
+          <w:bCs/>
+          <w:sz w:val="36"/>
+          <w:szCs w:val="30"/>
+          <w:u w:val="single"/>
+          <w:rtl/>
+        </w:rPr>
+      </w:pPr>
+      <w:r>
+        <w:rPr>
+          <w:rFonts w:ascii="Fb CoherentiSansEnHeb Medium" w:hAnsi="Fb CoherentiSansEnHeb Medium" w:cstheme="minorBidi"/>
+          <w:sz w:val="32"/>
+          <w:szCs w:val="32"/>
+          <w:rtl/>
+        </w:rPr>
+        <w:t>לכל שאלה, או תהייה אני כאן :)</w:t>
+      </w:r>
+      <w:bookmarkStart w:id="0" w:name="_GoBack"/>
+      <w:bookmarkEnd w:id="0"/>
+    </w:p>
     <w:p>
       <w:pPr>
         <w:ind w:left="594"/>
@@ -866,11 +1938,11 @@
       </w:pPr>
     </w:p>
     <w:sectPr>
-      <w:headerReference w:type="even" r:id="rId9"/>
-      <w:headerReference w:type="default" r:id="rId10"/>
-      <w:footerReference w:type="even" r:id="rId11"/>
-      <w:headerReference w:type="first" r:id="rId12"/>
-      <w:footerReference w:type="first" r:id="rId13"/>
+      <w:headerReference w:type="even" r:id="rId15"/>
+      <w:headerReference w:type="default" r:id="rId16"/>
+      <w:footerReference w:type="even" r:id="rId17"/>
+      <w:headerReference w:type="first" r:id="rId18"/>
+      <w:footerReference w:type="first" r:id="rId19"/>
       <w:pgSz w:w="12240" w:h="15840"/>
       <w:pgMar w:top="720" w:right="720" w:bottom="720" w:left="720" w:header="720" w:footer="720" w:gutter="0"/>
       <w:pgNumType w:start="1"/>
@@ -3450,7 +4522,6 @@
   <w:style w:type="character" w:styleId="Hyperlink">
     <w:name w:val="Hyperlink"/>
     <w:uiPriority w:val="99"/>
-    <w:semiHidden/>
     <w:unhideWhenUsed/>
     <w:rsid w:val="006D402B"/>
     <w:rPr>
@@ -5319,7 +6390,7 @@
 </file>
 
 <file path=customXml/itemProps2.xml><?xml version="1.0" encoding="utf-8"?>
-<ds:datastoreItem xmlns:ds="http://schemas.openxmlformats.org/officeDocument/2006/customXml" ds:itemID="{E4E45ADB-1682-4846-A459-6E5C97CBB0BB}">
+<ds:datastoreItem xmlns:ds="http://schemas.openxmlformats.org/officeDocument/2006/customXml" ds:itemID="{0B443A2D-DC8D-A24F-B1D5-D56ECA95CCFA}">
   <ds:schemaRefs>
     <ds:schemaRef ds:uri="http://schemas.openxmlformats.org/officeDocument/2006/bibliography"/>
   </ds:schemaRefs>

</xml_diff>

<commit_message>
added monthly payments price slider and made some UI improvements
</commit_message>
<xml_diff>
--- a/public/planningTemplate.docx
+++ b/public/planningTemplate.docx
@@ -750,7 +750,6 @@
           <w:sz w:val="30"/>
           <w:szCs w:val="30"/>
           <w:u w:val="single"/>
-          <w:rtl/>
         </w:rPr>
       </w:pPr>
       <w:r>
@@ -817,12 +816,148 @@
       <w:pPr>
         <w:ind w:left="594"/>
         <w:rPr>
+          <w:rFonts w:ascii="Fb CoherentiSansEnHeb Medium" w:hAnsi="Fb CoherentiSansEnHeb Medium" w:cstheme="majorBidi"/>
+          <w:b/>
+          <w:bCs/>
+          <w:sz w:val="30"/>
+          <w:szCs w:val="30"/>
+          <w:u w:val="single"/>
+        </w:rPr>
+      </w:pPr>
+    </w:p>
+    <w:p>
+      <w:pPr>
+        <w:ind w:left="594"/>
+        <w:rPr>
+          <w:rFonts w:ascii="Fb CoherentiSansEnHeb Medium" w:hAnsi="Fb CoherentiSansEnHeb Medium" w:cstheme="majorBidi"/>
+          <w:b/>
+          <w:bCs/>
+          <w:sz w:val="32"/>
+          <w:szCs w:val="32"/>
+          <w:u w:val="single"/>
+          <w:rtl/>
+        </w:rPr>
+      </w:pPr>
+      <w:r>
+        <w:rPr>
+          <w:rFonts w:ascii="Fb CoherentiSansEnHeb Medium" w:hAnsi="Fb CoherentiSansEnHeb Medium" w:cstheme="majorBidi" w:hint="cs"/>
+          <w:b/>
+          <w:bCs/>
+          <w:sz w:val="32"/>
+          <w:szCs w:val="32"/>
+          <w:u w:val="single"/>
+          <w:rtl/>
+        </w:rPr>
+        <w:t xml:space="preserve">עלות </w:t>
+      </w:r>
+      <w:r>
+        <w:rPr>
+          <w:rFonts w:ascii="Fb CoherentiSansEnHeb Medium" w:hAnsi="Fb CoherentiSansEnHeb Medium" w:cstheme="majorBidi" w:hint="cs"/>
+          <w:b/>
+          <w:bCs/>
+          <w:sz w:val="32"/>
+          <w:szCs w:val="32"/>
+          <w:u w:val="single"/>
+          <w:rtl/>
+        </w:rPr>
+        <w:t>ליווי חודשי מתמשך</w:t>
+      </w:r>
+      <w:r>
+        <w:rPr>
+          <w:rFonts w:ascii="Fb CoherentiSansEnHeb Medium" w:hAnsi="Fb CoherentiSansEnHeb Medium" w:cstheme="majorBidi" w:hint="cs"/>
+          <w:b/>
+          <w:bCs/>
+          <w:sz w:val="32"/>
+          <w:szCs w:val="32"/>
+          <w:u w:val="single"/>
+          <w:rtl/>
+        </w:rPr>
+        <w:t xml:space="preserve"> </w:t>
+      </w:r>
+      <w:r>
+        <w:rPr>
+          <w:rFonts w:ascii="Fb CoherentiSansEnHeb Medium" w:hAnsi="Fb CoherentiSansEnHeb Medium" w:cstheme="majorBidi"/>
+          <w:b/>
+          <w:bCs/>
+          <w:sz w:val="30"/>
+          <w:szCs w:val="30"/>
+          <w:u w:val="single"/>
+          <w:rtl/>
+        </w:rPr>
+        <w:t>–</w:t>
+      </w:r>
+      <w:r>
+        <w:rPr>
+          <w:rFonts w:ascii="Fb CoherentiSansEnHeb Medium" w:hAnsi="Fb CoherentiSansEnHeb Medium" w:cstheme="majorBidi" w:hint="cs"/>
+          <w:b/>
+          <w:bCs/>
+          <w:sz w:val="30"/>
+          <w:szCs w:val="30"/>
+          <w:u w:val="single"/>
+          <w:rtl/>
+        </w:rPr>
+        <w:t xml:space="preserve"> </w:t>
+      </w:r>
+      <w:r>
+        <w:rPr>
+          <w:rFonts w:ascii="Fb CoherentiSansEnHeb Medium" w:hAnsi="Fb CoherentiSansEnHeb Medium" w:cstheme="minorBidi" w:hint="cs"/>
+          <w:b/>
+          <w:bCs/>
+          <w:sz w:val="30"/>
+          <w:szCs w:val="30"/>
+          <w:u w:val="single"/>
+          <w:rtl/>
+        </w:rPr>
+        <w:t>{</w:t>
+      </w:r>
+      <w:r>
+        <w:rPr>
+          <w:rFonts w:ascii="Fb CoherentiSansEnHeb Medium" w:hAnsi="Fb CoherentiSansEnHeb Medium" w:cstheme="minorBidi"/>
+          <w:b/>
+          <w:bCs/>
+          <w:sz w:val="30"/>
+          <w:szCs w:val="30"/>
+          <w:u w:val="single"/>
+        </w:rPr>
+        <w:t>step3Total</w:t>
+      </w:r>
+      <w:r>
+        <w:rPr>
+          <w:rFonts w:ascii="Fb CoherentiSansEnHeb Medium" w:hAnsi="Fb CoherentiSansEnHeb Medium" w:cstheme="minorBidi" w:hint="cs"/>
+          <w:b/>
+          <w:bCs/>
+          <w:sz w:val="30"/>
+          <w:szCs w:val="30"/>
+          <w:u w:val="single"/>
+          <w:rtl/>
+        </w:rPr>
+        <w:t>}</w:t>
+      </w:r>
+      <w:r>
+        <w:rPr>
+          <w:rFonts w:ascii="Fb CoherentiSansEnHeb Medium" w:hAnsi="Fb CoherentiSansEnHeb Medium" w:cstheme="minorBidi" w:hint="cs"/>
+          <w:b/>
+          <w:bCs/>
+          <w:sz w:val="30"/>
+          <w:szCs w:val="30"/>
+          <w:u w:val="single"/>
+          <w:rtl/>
+        </w:rPr>
+        <w:t xml:space="preserve"> ₪</w:t>
+      </w:r>
+    </w:p>
+    <w:p>
+      <w:pPr>
+        <w:ind w:left="594"/>
+        <w:rPr>
           <w:rFonts w:ascii="Fb CoherentiSansEnHeb Medium" w:hAnsi="Fb CoherentiSansEnHeb Medium" w:cstheme="minorBidi"/>
           <w:sz w:val="30"/>
           <w:szCs w:val="30"/>
           <w:rtl/>
         </w:rPr>
       </w:pPr>
+      <w:bookmarkStart w:id="0" w:name="_GoBack"/>
+      <w:bookmarkEnd w:id="0"/>
     </w:p>
     <w:p>
       <w:pPr>
@@ -1922,8 +2057,6 @@
         </w:rPr>
         <w:t>לכל שאלה, או תהייה אני כאן :)</w:t>
       </w:r>
-      <w:bookmarkStart w:id="0" w:name="_GoBack"/>
-      <w:bookmarkEnd w:id="0"/>
     </w:p>
     <w:p>
       <w:pPr>
@@ -6390,7 +6523,7 @@
 </file>
 
 <file path=customXml/itemProps2.xml><?xml version="1.0" encoding="utf-8"?>
-<ds:datastoreItem xmlns:ds="http://schemas.openxmlformats.org/officeDocument/2006/customXml" ds:itemID="{0B443A2D-DC8D-A24F-B1D5-D56ECA95CCFA}">
+<ds:datastoreItem xmlns:ds="http://schemas.openxmlformats.org/officeDocument/2006/customXml" ds:itemID="{A13F1531-41C9-2242-88A0-C14926E27F6A}">
   <ds:schemaRefs>
     <ds:schemaRef ds:uri="http://schemas.openxmlformats.org/officeDocument/2006/bibliography"/>
   </ds:schemaRefs>

</xml_diff>